<commit_message>
Apply edited markdown manual content
</commit_message>
<xml_diff>
--- a/exports/market-service-manual.docx
+++ b/exports/market-service-manual.docx
@@ -153,7 +153,7 @@
                 <w:color w:val="1D1D1F"/>
                 <w:sz w:val="20"/>
               </w:rPr>
-              <w:t>不管人是破冰来的、转介绍来的，还是直播间来的粉丝，第一件事不是讲一堆知识，而是通过简单沟通了解他需要解决什么问题。</w:t>
+              <w:t>不管人是破冰来的、转介绍来的，还是直播间来的粉丝，第一件事不是讲一堆知识，而是通过简单沟通发问了解他需要解决什么问题。</w:t>
             </w:r>
           </w:p>
         </w:tc>
@@ -216,15 +216,15 @@
         <w:spacing w:after="60"/>
       </w:pPr>
       <w:r>
-        <w:t>1. 简单沟通，先了解他需要解决什么问题。</w:t>
-      </w:r>
-    </w:p>
-    <w:p>
-      <w:pPr>
-        <w:spacing w:after="60"/>
-      </w:pPr>
-      <w:r>
-        <w:t>2. 不分析、不安慰、不证明自己懂，不急着给答案。</w:t>
+        <w:t>1. 简单沟通发问，先了解他需要解决什么问题。</w:t>
+      </w:r>
+    </w:p>
+    <w:p>
+      <w:pPr>
+        <w:spacing w:after="60"/>
+      </w:pPr>
+      <w:r>
+        <w:t>2. 不分析、不安慰、不证明自己懂，自己很牛×，不急着给答案。</w:t>
       </w:r>
     </w:p>
     <w:p>
@@ -240,7 +240,7 @@
         <w:spacing w:after="60"/>
       </w:pPr>
       <w:r>
-        <w:t>4. 把下一步引到免费幸福沙龙。</w:t>
+        <w:t>4. 提学习要求，进入到免费幸福沙龙。</w:t>
       </w:r>
     </w:p>
     <w:p>
@@ -272,7 +272,7 @@
         <w:spacing w:after="60"/>
       </w:pPr>
       <w:r>
-        <w:t>3. 统一用万能话术承接，把人引到免费幸福沙龙。</w:t>
+        <w:t>3. 统一用万能话术承接，并提学习要求，能做到，排队进入到免费幸福沙龙。</w:t>
       </w:r>
     </w:p>
     <w:p>
@@ -295,7 +295,7 @@
     </w:p>
     <w:p>
       <w:r>
-        <w:t>你看你如果愿意，我通知你参加。</w:t>
+        <w:t>你如果想要自己解决，参加幸福沙龙，我给你申请排队。</w:t>
       </w:r>
     </w:p>
     <w:p>
@@ -327,7 +327,7 @@
         <w:spacing w:after="60"/>
       </w:pPr>
       <w:r>
-        <w:t>3. 有没有把下一步明确引到免费幸福沙龙？</w:t>
+        <w:t>3. 有没有提要求，让顾客进入到免费幸福沙龙？</w:t>
       </w:r>
     </w:p>
     <w:p>
@@ -429,7 +429,7 @@
                 <w:color w:val="1D1D1F"/>
                 <w:sz w:val="20"/>
               </w:rPr>
-              <w:t>沙龙不是讲知识炫能力，而是用体验、发问、点评、作业，让顾客把注意力回到自己身上，自己看见问题。</w:t>
+              <w:t>沙龙不是讲知识炫能力，而是用互动体验、发问、点评、严格完成作业，让顾客把注意力回到自己身上，自己看见问题。</w:t>
             </w:r>
           </w:p>
         </w:tc>
@@ -556,7 +556,7 @@
         <w:spacing w:after="60"/>
       </w:pPr>
       <w:r>
-        <w:t>9. 留作业、收作业。</w:t>
+        <w:t>9. 留作业、收作业</w:t>
       </w:r>
     </w:p>
     <w:p>
@@ -1059,63 +1059,23 @@
         <w:spacing w:after="60"/>
       </w:pPr>
       <w:r>
-        <w:t>1. 沙龙或者转介绍筛选导入。</w:t>
-      </w:r>
-    </w:p>
-    <w:p>
-      <w:pPr>
-        <w:spacing w:after="60"/>
-      </w:pPr>
-      <w:r>
-        <w:t>2. 一个教练带2个顾客，不能混营。</w:t>
-      </w:r>
-    </w:p>
-    <w:p>
-      <w:pPr>
-        <w:spacing w:after="60"/>
-      </w:pPr>
-      <w:r>
-        <w:t>3. 每天课程前通关。</w:t>
-      </w:r>
-    </w:p>
-    <w:p>
-      <w:pPr>
-        <w:spacing w:after="60"/>
-      </w:pPr>
-      <w:r>
-        <w:t>4. 每天提要求。</w:t>
-      </w:r>
-    </w:p>
-    <w:p>
-      <w:pPr>
-        <w:spacing w:after="60"/>
-      </w:pPr>
-      <w:r>
-        <w:t>5. 每天主题训练。</w:t>
-      </w:r>
-    </w:p>
-    <w:p>
-      <w:pPr>
-        <w:spacing w:after="60"/>
-      </w:pPr>
-      <w:r>
-        <w:t>6. 每天留作业、收作业。</w:t>
-      </w:r>
-    </w:p>
-    <w:p>
-      <w:pPr>
-        <w:spacing w:after="60"/>
-      </w:pPr>
-      <w:r>
-        <w:t>7. 有突破榜样，统一进群，等待被采访。</w:t>
-      </w:r>
-    </w:p>
-    <w:p>
-      <w:pPr>
-        <w:spacing w:after="60"/>
-      </w:pPr>
-      <w:r>
-        <w:t>8. 每天复盘反馈。</w:t>
+        <w:t>1. 开营（发心，自我介绍，播放《蚂蚁死亡漩涡》视频，发问讨论，讲群规，学习要求，作业要求，提醒下载腾讯会议室）</w:t>
+      </w:r>
+    </w:p>
+    <w:p>
+      <w:pPr>
+        <w:spacing w:after="60"/>
+      </w:pPr>
+      <w:r>
+        <w:t>2. 营中（7天按照沙龙流程进行，发掘采访榜样，激发学员参与系统学习）</w:t>
+      </w:r>
+    </w:p>
+    <w:p>
+      <w:pPr>
+        <w:spacing w:after="60"/>
+      </w:pPr>
+      <w:r>
+        <w:t>3. 闭营（每个人分享 7 天下来的收获和感受，5 分钟/人；发心心愿拔高；筛选培养教练；激发参与系统学习）</w:t>
       </w:r>
     </w:p>
     <w:p>
@@ -1178,12 +1138,27 @@
     </w:p>
     <w:p>
       <w:r>
-        <w:t>最好的办法就是一定要按照标准参与。</w:t>
-      </w:r>
-    </w:p>
-    <w:p>
-      <w:r>
-        <w:t>看别人炒菜和自己动手炒菜，谁学会的更快？</w:t>
+        <w:t>大家想一阵子幸福，还是一辈子幸福？</w:t>
+      </w:r>
+    </w:p>
+    <w:p>
+      <w:r>
+        <w:t>这些问题是你没学习之前能意识到，还是学习后意识到的？</w:t>
+      </w:r>
+    </w:p>
+    <w:p>
+      <w:r>
+        <w:t>如果到现在还没有参加过这样的学习，错误的方式持续下去会出现什么样的后果？</w:t>
+      </w:r>
+    </w:p>
+    <w:p>
+      <w:r>
+        <w:t>这样的结果是你想要的吗？如果不想要，正确的做法，我们应该怎么做呢？（答案让对方说出来）</w:t>
+      </w:r>
+    </w:p>
+    <w:p>
+      <w:r>
+        <w:t>你是自己摸索，还是系统的参与？</w:t>
       </w:r>
     </w:p>
     <w:p>
@@ -1216,6 +1191,14 @@
       </w:pPr>
       <w:r>
         <w:t>3. 效果不理想时，有没有第一时间复盘流程和教练问题？</w:t>
+      </w:r>
+    </w:p>
+    <w:p>
+      <w:pPr>
+        <w:spacing w:after="60"/>
+      </w:pPr>
+      <w:r>
+        <w:t>4. 学员没有完成作业，有没有第一时间复盘流程和教练的问题？不要第一反应就是找学员的问题！</w:t>
       </w:r>
     </w:p>
     <w:p>
@@ -1392,43 +1375,34 @@
       </w:r>
     </w:p>
     <w:p>
-      <w:pPr>
-        <w:spacing w:after="60"/>
-      </w:pPr>
-      <w:r>
-        <w:t>3.你今天你给哪一个家人表达了，在哪一个场景下用的？</w:t>
-      </w:r>
-    </w:p>
-    <w:p>
-      <w:pPr>
-        <w:spacing w:after="60"/>
-      </w:pPr>
-      <w:r>
-        <w:t>4.你当时说了一段什么样的话，你的家人给了你什么样的一个反应或者反馈？</w:t>
-      </w:r>
-    </w:p>
-    <w:p>
-      <w:pPr>
-        <w:spacing w:after="60"/>
-      </w:pPr>
-      <w:r>
-        <w:t>5.你又是什么样的心情？</w:t>
-      </w:r>
-    </w:p>
-    <w:p>
-      <w:pPr>
-        <w:spacing w:after="60"/>
-      </w:pPr>
-      <w:r>
-        <w:t>6.提交方式：文字语音不限作业。</w:t>
-      </w:r>
-    </w:p>
-    <w:p>
-      <w:pPr>
-        <w:spacing w:after="60"/>
-      </w:pPr>
-      <w:r>
-        <w:t>7.提交时间：明天上午8点钟之前。</w:t>
+      <w:r>
+        <w:t>你今天你给哪一个家人表达了，在哪一个场景下用的？</w:t>
+      </w:r>
+    </w:p>
+    <w:p>
+      <w:r>
+        <w:t>你当时说了一段什么样的话，你的家人给了你什么样的一个反应或者反馈？</w:t>
+      </w:r>
+    </w:p>
+    <w:p>
+      <w:r>
+        <w:t>你又是什么样的心情？</w:t>
+      </w:r>
+    </w:p>
+    <w:p>
+      <w:pPr>
+        <w:spacing w:after="60"/>
+      </w:pPr>
+      <w:r>
+        <w:t>3.提交方式：文字语音不限作业。</w:t>
+      </w:r>
+    </w:p>
+    <w:p>
+      <w:pPr>
+        <w:spacing w:after="60"/>
+      </w:pPr>
+      <w:r>
+        <w:t>4.提交时间：明天上午8点钟之前。</w:t>
       </w:r>
     </w:p>
     <w:p>
@@ -1677,7 +1651,7 @@
         <w:spacing w:after="60"/>
       </w:pPr>
       <w:r>
-        <w:t>2. 进入一个环境，持续学习，持续改变，越来越好。</w:t>
+        <w:t>2. 进入一个环境，持续学习，持续改变，帮助别人提升自己，越来越好。</w:t>
       </w:r>
     </w:p>
     <w:p>
@@ -1698,17 +1672,32 @@
     </w:p>
     <w:p>
       <w:r>
-        <w:t>一天的学习不能解决一辈子的问题。</w:t>
-      </w:r>
-    </w:p>
-    <w:p>
-      <w:r>
-        <w:t>只有持续学习，才不会让生活过得一地鸡毛。</w:t>
-      </w:r>
-    </w:p>
-    <w:p>
-      <w:r>
-        <w:t>进入一个环境，持续学习，持续改变，越来越好。</w:t>
+        <w:t>一阵子的学习，能不能解决一辈子的问题？</w:t>
+      </w:r>
+    </w:p>
+    <w:p>
+      <w:r>
+        <w:t>很多人通过学习，悟到了，找到了自己的幸福希望</w:t>
+      </w:r>
+    </w:p>
+    <w:p>
+      <w:r>
+        <w:t>依然有三种选择</w:t>
+      </w:r>
+    </w:p>
+    <w:p>
+      <w:r>
+        <w:t>一种是发现问题，找到原因，放任不管</w:t>
+      </w:r>
+    </w:p>
+    <w:p>
+      <w:r>
+        <w:t>一种是靠自己去摸索，摸着石头过河</w:t>
+      </w:r>
+    </w:p>
+    <w:p>
+      <w:r>
+        <w:t>一种是跟着榜样，进入环境系统学习，掌握解决问题的能力，掌握幸福的能力</w:t>
       </w:r>
     </w:p>
     <w:p>
@@ -2181,47 +2170,15 @@
         <w:spacing w:after="60"/>
       </w:pPr>
       <w:r>
-        <w:t>1. 7天毕业且满足要求，才能升级进入。</w:t>
-      </w:r>
-    </w:p>
-    <w:p>
-      <w:pPr>
-        <w:spacing w:after="60"/>
-      </w:pPr>
-      <w:r>
-        <w:t>2. 单营不超过10人，可同时开多个营，不能混营。</w:t>
-      </w:r>
-    </w:p>
-    <w:p>
-      <w:pPr>
-        <w:spacing w:after="60"/>
-      </w:pPr>
-      <w:r>
-        <w:t>3. 实行一人一课。</w:t>
-      </w:r>
-    </w:p>
-    <w:p>
-      <w:pPr>
-        <w:spacing w:after="60"/>
-      </w:pPr>
-      <w:r>
-        <w:t>4. 每天预习通关。</w:t>
-      </w:r>
-    </w:p>
-    <w:p>
-      <w:pPr>
-        <w:spacing w:after="60"/>
-      </w:pPr>
-      <w:r>
-        <w:t>5. 每天完成作业并提交。</w:t>
-      </w:r>
-    </w:p>
-    <w:p>
-      <w:pPr>
-        <w:spacing w:after="60"/>
-      </w:pPr>
-      <w:r>
-        <w:t>6. 每天反馈复盘。</w:t>
+        <w:t>1. 每天流程同单次沙龙流程。</w:t>
+      </w:r>
+    </w:p>
+    <w:p>
+      <w:pPr>
+        <w:spacing w:after="60"/>
+      </w:pPr>
+      <w:r>
+        <w:t>2. 核心目的在于锻炼培养人才，听众多少，内容选择等是次要目标。</w:t>
       </w:r>
     </w:p>
     <w:p>
@@ -2245,15 +2202,23 @@
         <w:spacing w:after="60"/>
       </w:pPr>
       <w:r>
-        <w:t>2. 单营人数不超过10人，可同时开设多个营，不能混营。</w:t>
-      </w:r>
-    </w:p>
-    <w:p>
-      <w:pPr>
-        <w:spacing w:after="60"/>
-      </w:pPr>
-      <w:r>
-        <w:t>3. 实行一人一课制度，每位讲师只负责讲1堂课，每天必须完成作业并提交。</w:t>
+        <w:t>2. 报名系统学习，意愿强烈，才能升级进入幸福早课人才培养营。</w:t>
+      </w:r>
+    </w:p>
+    <w:p>
+      <w:pPr>
+        <w:spacing w:after="60"/>
+      </w:pPr>
+      <w:r>
+        <w:t>3. 单营人数不超过10人，可同时开设多个营，不能混营。</w:t>
+      </w:r>
+    </w:p>
+    <w:p>
+      <w:pPr>
+        <w:spacing w:after="60"/>
+      </w:pPr>
+      <w:r>
+        <w:t>4. 实行一人一课制度，每位讲师只负责讲1堂课，每天必须通关，完成作业并提交，反馈复盘。</w:t>
       </w:r>
     </w:p>
     <w:p>
@@ -2266,17 +2231,32 @@
     </w:p>
     <w:p>
       <w:r>
-        <w:t>我们先把幸福能力练扎实，再进入更系统的成长。</w:t>
-      </w:r>
-    </w:p>
-    <w:p>
-      <w:r>
-        <w:t>所有人都按照标准参与，教练也要完成作业。</w:t>
-      </w:r>
-    </w:p>
-    <w:p>
-      <w:r>
-        <w:t>通一节、练一节、反馈一节。</w:t>
+        <w:t>很多人的人生梦想是幸福，健康，有钱</w:t>
+      </w:r>
+    </w:p>
+    <w:p>
+      <w:r>
+        <w:t>哪一个事业可以做到？</w:t>
+      </w:r>
+    </w:p>
+    <w:p>
+      <w:r>
+        <w:t>唯有幸福事业可以让你</w:t>
+      </w:r>
+    </w:p>
+    <w:p>
+      <w:r>
+        <w:t>在学习的过程中，帮助别人，拯救了自己，掌握幸福健康的能力</w:t>
+      </w:r>
+    </w:p>
+    <w:p>
+      <w:r>
+        <w:t>在学习的过程中，帮助别人，提升自己，让好人赚到钱</w:t>
+      </w:r>
+    </w:p>
+    <w:p>
+      <w:r>
+        <w:t>如果想要通过筛选，掌握幸福能力，具备给别人带来幸福的能力</w:t>
       </w:r>
     </w:p>
     <w:p>
@@ -2710,7 +2690,6 @@
         <w:br/>
         <w:t>3）顾客未来可能做到，点出自信和可能</w:t>
         <w:br/>
-        <w:br/>
         <w:t>点评的七个角度：</w:t>
         <w:br/>
         <w:t>第一，点评对方外在</w:t>
@@ -2945,7 +2924,9 @@
     </w:p>
     <w:p>
       <w:r>
-        <w:t>一个服务理念：扶正祛邪，与人相处最高境界就是去激发人的善意，把负能量转换成正能量，才能创造幸福力量。一类角色定位：你是幸福导游员，不创造景区，不剧透，只带领进入景区，让学员身临其境体验，自己感受美好；你是受益分享者，不传授知识，只引导帮助找到问题，始终激活学习心态，与学员共同成长。</w:t>
+        <w:t>一个服务理念：扶正祛邪，与人相处最高境界就是去激发人的善意，把负能量转换成正能量，才能创造幸福力量。</w:t>
+        <w:br/>
+        <w:t>一类角色定位：你是幸福导游员，不创造景区，不剧透，只带领进入景区，让学员身临其境体验，自己感受美好；你是受益分享者，不传授知识，只引导帮助找到问题，始终激活学习心态，与学员共同成长。</w:t>
       </w:r>
     </w:p>
     <w:p>
@@ -2958,7 +2939,17 @@
     </w:p>
     <w:p>
       <w:r>
-        <w:t>两个沟通心法：发问转念，点评引导顾客的注意力在自己身上；发问做选择题，用标准规律帮助学员做选择题，引导学员进入系统学习。两种开拓方法：一对一标准沟通；线上、线下沙龙。</w:t>
+        <w:t>两个沟通心法：</w:t>
+        <w:br/>
+        <w:t>发问转念，点评引导顾客的注意力在自己身上；</w:t>
+        <w:br/>
+        <w:t>发问做选择题，用标准规律帮助学员做选择题，引导学员进入系统学习。</w:t>
+        <w:br/>
+        <w:t>两种开拓方法：</w:t>
+        <w:br/>
+        <w:t>一对一标准沟通；</w:t>
+        <w:br/>
+        <w:t>线上、线下沙龙。</w:t>
       </w:r>
     </w:p>
     <w:p>
@@ -2971,7 +2962,21 @@
     </w:p>
     <w:p>
       <w:r>
-        <w:t>帮助目标：每天帮助3-5个人，实现1人进入私域。服务目标：每天沟通付费学员1-3个人，每3天筛选成长变化榜样1人。学习目标：每天查漏补缺，基础技能精通与实战。三大核心关注：关注成长，成功自然出现；关注过程，结果自然出现；关注行动，效果自然出现。</w:t>
+        <w:t>三个必做目标</w:t>
+        <w:br/>
+        <w:t>帮助目标：每天1场幸福沙龙。</w:t>
+        <w:br/>
+        <w:t>服务目标：每天点评3个学员。</w:t>
+        <w:br/>
+        <w:t>学习目标：每天学习1课，主课或者一分钟，完成作业，做好技能精进和内容储备。</w:t>
+        <w:br/>
+        <w:t>三大核心关注：</w:t>
+        <w:br/>
+        <w:t>关注成长，成功自然出现；</w:t>
+        <w:br/>
+        <w:t>关注过程，结果自然出现；</w:t>
+        <w:br/>
+        <w:t>关注行动，效果自然出现。</w:t>
       </w:r>
     </w:p>
     <w:p>
@@ -2984,7 +2989,23 @@
     </w:p>
     <w:p>
       <w:r>
-        <w:t>四步服务流程：进人-直播、沙龙；留人-内容工具与情感服务；育人-付费学习；转人-转介绍、转合作。四阶人才漏斗：粉丝、客户、优质客户、合作伙伴。四种人才特征：特种兵、普通兵、潜水兵、逃兵，思考成为哪一种兵收获成长最快。四步个人服务步骤：检测-幸福自检表，问题可视化；诊断-一正一反对比，问出核心点，顾客知错；方案-基础群、公益课、专栏、研学班等不同阶段提高免疫力；陪伴-关系和成绩双提高，接幸福回家。</w:t>
+        <w:t>四步服务流程：</w:t>
+        <w:br/>
+        <w:t>留人--内容工具与情感服务；</w:t>
+        <w:br/>
+        <w:t>育人--付费学习；</w:t>
+        <w:br/>
+        <w:t>进人--转介绍；</w:t>
+        <w:br/>
+        <w:t>转人--转介绍、转合作。</w:t>
+        <w:br/>
+        <w:t>四阶人才漏斗：</w:t>
+        <w:br/>
+        <w:t>粉丝、顾客、优质顾客、合作伙伴。</w:t>
+        <w:br/>
+        <w:t>四种人才特征：</w:t>
+        <w:br/>
+        <w:t>特种兵、普通兵、潜水兵、逃兵，思考成为哪一种兵收获成长最快。</w:t>
       </w:r>
     </w:p>
     <w:p>
@@ -2997,7 +3018,21 @@
     </w:p>
     <w:p>
       <w:r>
-        <w:t>五步标准沟通：破冰，让人好奇想找你；原理，通过课程、一分钟、互动游戏、故事、榜样案例等找到正确方向；堵门，用选择题和转念只能选一条路；下危机，用故事或案例说明持续发展的后果；闭环，用发问和做选择题引导进入学习，彻底解决问题。五步人才培养：激活、排队、筛选、培养、裂变。</w:t>
+        <w:t>五步标准沟通：</w:t>
+        <w:br/>
+        <w:t>破冰，让人好奇想找你；</w:t>
+        <w:br/>
+        <w:t>原理，通过课程、一分钟、互动游戏、故事、榜样案例等找到正确方向；</w:t>
+        <w:br/>
+        <w:t>堵门，用选择题和转念只能选一条路；</w:t>
+        <w:br/>
+        <w:t>下危机，用故事或案例说明持续发展的后果；</w:t>
+        <w:br/>
+        <w:t>闭环，用发问和做选择题引导进入学习，彻底解决问题。</w:t>
+        <w:br/>
+        <w:t>五步人才培养：</w:t>
+        <w:br/>
+        <w:t>激活、排队、筛选、培养、裂变。</w:t>
       </w:r>
     </w:p>
     <w:p>
@@ -3010,7 +3045,19 @@
     </w:p>
     <w:p>
       <w:r>
-        <w:t>精通产品：精通10条每日一分钟、五堂课、产品核心优势与卖点。销售问题：常见问题问答库，包括价格、时间、信任等。主线提问：始终记得主要任务是让学员进入学习，把注意力引导到真正问题上。销售流程：四步服务流程。案例榜样：5个市场服务经典榜样、5个学习成果经典榜样。工具宝库：视频号、公众号、鸡腿群、钉钉内容群、公益课、专栏课程、一分钟宝典、智慧父母系列公益课等。</w:t>
+        <w:t>精通产品：</w:t>
+        <w:br/>
+        <w:t>精通10条每日一分钟、五堂课、产品核心优势与卖点。</w:t>
+        <w:br/>
+        <w:t>销售问题：常见问题问答库，包括价格、时间、信任等。</w:t>
+        <w:br/>
+        <w:t>主线提问：始终记得主要任务是让学员进入系统学习，把注意力引导到真正问题上。</w:t>
+        <w:br/>
+        <w:t>销售流程：四步服务流程。</w:t>
+        <w:br/>
+        <w:t>案例榜样：5个市场服务经典榜样、5个学习成果经典榜样。</w:t>
+        <w:br/>
+        <w:t>工具宝库：视频号、公众号、鸡腿群、钉钉内容群、公益课、专栏课程、一分钟宝典、智慧父母系列公益课等。</w:t>
       </w:r>
     </w:p>
     <w:p>
@@ -3023,7 +3070,19 @@
     </w:p>
     <w:p>
       <w:r>
-        <w:t>无论一对一、直播还是沙龙，核心目的都是用转念和做选择题帮助学员进入学习。想尽一切办法帮助学员进入系统学习，从中自我感悟、知错、内观、行动，才是使命的唯一途径。三种学员不收：家人反对坚决不收；有经济负担不收；不愿意学习成长、只想坐享其成、有搞定别人心态的人不收。只收一种学员：愿意为自己和家人的幸福负责，下定决心成长改变，愿意突破，为三代人的幸福打基础的人。</w:t>
+        <w:t>无论一对一、直播还是沙龙，核心目的都是用转念和做选择题帮助学员进入学习。想尽一切办法帮助学员进入系统学习，从中自我感悟、知错、内观、行动，才是使命的唯一途径。</w:t>
+        <w:br/>
+        <w:t>三种学员不收：</w:t>
+        <w:br/>
+        <w:t>家人反对坚决不收（参加学习，影响家庭关系）；</w:t>
+        <w:br/>
+        <w:t>有经济负担不收（都没有钱吃饭了，先保证基本生活）；</w:t>
+        <w:br/>
+        <w:t>不愿意学习成长、只想坐享其成、有搞定别人心态的人不收。（自私自利，不知感恩，掌握能力会给家庭造成更大灾难）</w:t>
+        <w:br/>
+        <w:t>只收一种学员：</w:t>
+        <w:br/>
+        <w:t>愿意为自己和家人的幸福负责，下定决心成长改变，愿意突破，为三代人的幸福打基础的人。（好人掌握能力有好报）</w:t>
       </w:r>
     </w:p>
     <w:p>
@@ -3044,7 +3103,11 @@
     </w:p>
     <w:p>
       <w:r>
-        <w:t>所有人的角色都是受益分享者，不是老师，不是导师，不是大师。总监干三件事：育人才、挖沙子、淘金子；驿站主干两件事：挖沙子、淘金子。</w:t>
+        <w:t>所有人的角色都是受益分享者，不是老师，不是导师，不是大师。</w:t>
+        <w:br/>
+        <w:t>总监干三件事：育人才、挖沙子、淘金子；</w:t>
+        <w:br/>
+        <w:t>驿站主干两件事：挖沙子、淘金子。</w:t>
       </w:r>
     </w:p>
     <w:p>
@@ -3057,7 +3120,13 @@
     </w:p>
     <w:p>
       <w:r>
-        <w:t>用锄头：用点评、音频、视频、文字、图片等激活别人，也激活自己。挖沙子：用沙龙育人，也育自己，严格按照标准通关、操作、复盘。造筛子：按照标准发掘榜样，用榜样工具激活更多人行动。淘金子：用行动筛选，任何发出的要求都要有收回动作。</w:t>
+        <w:t>用锄头：用点评、音频、视频、文字、图片等激活别人，也激活自己。</w:t>
+        <w:br/>
+        <w:t>挖沙子：用沙龙育人，也育自己，严格按照标准通关、操作、复盘。</w:t>
+        <w:br/>
+        <w:t>造筛子：按照要求要求学员，筛选出真正想要的学员；按照标准要求发掘榜样，用榜样工具激活更多人行动。</w:t>
+        <w:br/>
+        <w:t>淘金子：用行动筛选，任何发出的要求都要有收回动作。</w:t>
       </w:r>
     </w:p>
     <w:p>
@@ -3070,7 +3139,11 @@
     </w:p>
     <w:p>
       <w:r>
-        <w:t>前10次约人由总监完成，让筛选出来的伙伴讲，破除邀约恐惧；要求把人讲死，不是讲活，破除担心讲坏的恐惧；讲完用标准复盘，破除随意修改流程标准的行为。</w:t>
+        <w:t>前10次约人由总监完成，让筛选出来的伙伴讲，破除邀约恐惧；</w:t>
+        <w:br/>
+        <w:t>要求把人讲死，不是讲活，破除担心讲坏的恐惧；</w:t>
+        <w:br/>
+        <w:t>讲完用标准复盘，破除随意修改流程标准的行为。</w:t>
       </w:r>
     </w:p>
     <w:p>
@@ -3083,7 +3156,7 @@
     </w:p>
     <w:p>
       <w:r>
-        <w:t>榜样工具邀约来人，幸福沙龙挖沙子淘金子，幸福转念训练营继续筛选，进入平台学习，梦想合并并重复前面三步。</w:t>
+        <w:t>榜样工具邀约来人，幸福沙龙挖沙子淘金子，幸福训练营继续筛选，进入平台学习，梦想合并并重复前面三步。</w:t>
       </w:r>
     </w:p>
     <w:p>
@@ -3096,7 +3169,9 @@
     </w:p>
     <w:p>
       <w:r>
-        <w:t>先调心态：相信流程是在激活人的善，心态对了才会行动。再问细节：用方向和流程标准复盘具体动作，问怎么做、做了多少次、对方怎么反应，最后定计划、提要求、收反馈。</w:t>
+        <w:t>先调心态：相信流程是在激活人的善，心态对了才会行动。</w:t>
+        <w:br/>
+        <w:t>再问细节：用方向和流程标准复盘具体动作，问怎么做、做了多少次、对方怎么反应，最后定计划、提要求、收反馈。</w:t>
       </w:r>
     </w:p>
     <w:p>
@@ -3109,7 +3184,9 @@
     </w:p>
     <w:p>
       <w:r>
-        <w:t>听不懂、学不会、没效果、副作用。对应解决方式是沙龙体验、榜样案例、真实细节变化、观察关系是否越来越好以及身边人是否反馈自己变好了。</w:t>
+        <w:t>听不懂、学不会、没效果、副作用。</w:t>
+        <w:br/>
+        <w:t>对应解决方式是沙龙体验、榜样案例、真实细节变化、观察关系是否越来越好以及身边人是否反馈自己变好了。</w:t>
       </w:r>
     </w:p>
     <w:p>
@@ -3117,12 +3194,14 @@
         <w:pStyle w:val="Heading2"/>
       </w:pPr>
       <w:r>
-        <w:t>7. 学习后五种效果</w:t>
-      </w:r>
-    </w:p>
-    <w:p>
-      <w:r>
-        <w:t>问题不再恶化、问题解决、其他问题解决、掌握能力、合并梦想。任何学员面前只有三条路：放任不管、自己摸索、进入环境持续学习持续改变。</w:t>
+        <w:t>7. 学习后五种结果</w:t>
+      </w:r>
+    </w:p>
+    <w:p>
+      <w:r>
+        <w:t>问题不再恶化、问题解决、其他问题解决、掌握能力、合并梦想。</w:t>
+        <w:br/>
+        <w:t>任何学员面前只有三条路：放任不管、自己摸索、进入环境持续学习持续改变。</w:t>
       </w:r>
     </w:p>
     <w:p>
@@ -3614,7 +3693,7 @@
     </w:p>
     <w:p>
       <w:r>
-        <w:t>（有事允许请假，人性化管理，放下一期就好了，但是连着两期学习态度不端正，取消学习资格，删除拉黑微信避免被消耗）</w:t>
+        <w:t>有事允许请假，人性化管理，放下一期就好了，但是连着两期学习态度不端正，取消学习资格，删除拉黑微信避免被消耗</w:t>
       </w:r>
     </w:p>
     <w:p>
@@ -3929,7 +4008,7 @@
         <w:spacing w:after="60"/>
       </w:pPr>
       <w:r>
-        <w:t>3.不配合、不按要求实践的学员，后面再给一次机会下次再参加，2次都不合格者，取消1年内学习资格</w:t>
+        <w:t>3.不配合、不按要求****实践的学员，后面再给一次机会下次再参加，2次都不合格者，取消1年内学习资格</w:t>
       </w:r>
     </w:p>
     <w:p>
@@ -4011,7 +4090,7 @@
     </w:p>
     <w:p>
       <w:r>
-        <w:t>（有事允许请假，人性化管理，放下一期就好了，但是连着两期学习态度不端正，取消学习资格，删除拉黑微信避免被消耗）</w:t>
+        <w:t>有事允许请假，人性化管理，放下一期就好了，但是连着两期学习态度不端正，取消学习资格，删除拉黑微信避免被消耗</w:t>
       </w:r>
     </w:p>
     <w:p>
@@ -4132,12 +4211,12 @@
     </w:p>
     <w:p>
       <w:r>
-        <w:t>（三）教练复盘流程与标准</w:t>
-      </w:r>
-    </w:p>
-    <w:p>
-      <w:r>
-        <w:t>一）晚上分享标准</w:t>
+        <w:t>**（三）教练复盘流程与标准</w:t>
+      </w:r>
+    </w:p>
+    <w:p>
+      <w:r>
+        <w:t>一）晚上分享标准**</w:t>
       </w:r>
     </w:p>
     <w:p>
@@ -4318,7 +4397,7 @@
     </w:p>
     <w:p>
       <w:r>
-        <w:t>学习带来的改变是一阵子，帮助别人带来的改变是一辈子。想不想掌握这种能力。</w:t>
+        <w:t>学习带来的改变是一阵子，帮助别人带来的改变是一辈子，想不想掌握这种能力。</w:t>
       </w:r>
     </w:p>
     <w:p>
@@ -4800,7 +4879,12 @@
         <w:spacing w:after="60"/>
       </w:pPr>
       <w:r>
-        <w:t>第一天从学会/好好说话开始（一）互动游戏：虽然+但是</w:t>
+        <w:t>第一天从学会/好好说话开始</w:t>
+      </w:r>
+    </w:p>
+    <w:p>
+      <w:r>
+        <w:t>（一）互动游戏：虽然+但是</w:t>
       </w:r>
     </w:p>
     <w:p>
@@ -4822,6 +4906,422 @@
       </w:r>
     </w:p>
     <w:p>
+      <w:pPr>
+        <w:spacing w:after="60"/>
+      </w:pPr>
+      <w:r>
+        <w:t>2.先用“虽然+优点，但是+缺点”的方式表达一遍</w:t>
+      </w:r>
+    </w:p>
+    <w:p>
+      <w:r>
+        <w:t>每个人感觉一下是一种什么样的感受？</w:t>
+      </w:r>
+    </w:p>
+    <w:p>
+      <w:r>
+        <w:t>每个人简单说一下自己听完之后什么样的感觉？</w:t>
+      </w:r>
+    </w:p>
+    <w:p>
+      <w:pPr>
+        <w:spacing w:after="60"/>
+      </w:pPr>
+      <w:r>
+        <w:t>3.接下来再用“虽然+缺点，但是+优点”的方式再表达一遍</w:t>
+      </w:r>
+    </w:p>
+    <w:p>
+      <w:r>
+        <w:t>每个人感觉一下是一种什么样的感受？</w:t>
+      </w:r>
+    </w:p>
+    <w:p>
+      <w:r>
+        <w:t>每个人简单说一下自己听完之后什么样的感觉？</w:t>
+      </w:r>
+    </w:p>
+    <w:p>
+      <w:r>
+        <w:t>操作提示：</w:t>
+      </w:r>
+    </w:p>
+    <w:p>
+      <w:pPr>
+        <w:spacing w:after="60"/>
+      </w:pPr>
+      <w:r>
+        <w:t>1)先把“虽然+优点，但是+缺点”公式打出来</w:t>
+      </w:r>
+    </w:p>
+    <w:p>
+      <w:pPr>
+        <w:spacing w:after="60"/>
+      </w:pPr>
+      <w:r>
+        <w:t>2)要表达出感受，而不是情绪</w:t>
+      </w:r>
+    </w:p>
+    <w:p>
+      <w:pPr>
+        <w:spacing w:after="60"/>
+      </w:pPr>
+      <w:r>
+        <w:t>3)先问两个人写的是谁？</w:t>
+      </w:r>
+    </w:p>
+    <w:p>
+      <w:pPr>
+        <w:spacing w:after="60"/>
+      </w:pPr>
+      <w:r>
+        <w:t>4)后面是缺点时，你的心情好不好？</w:t>
+      </w:r>
+    </w:p>
+    <w:p>
+      <w:r>
+        <w:t>后面是优点时，你的心情怎么样？</w:t>
+      </w:r>
+    </w:p>
+    <w:p>
+      <w:r>
+        <w:t>六、分享</w:t>
+      </w:r>
+    </w:p>
+    <w:p>
+      <w:r>
+        <w:t>每个人再简单分享一下，听到这种表达方式，有一种什么样的感觉？</w:t>
+      </w:r>
+    </w:p>
+    <w:p>
+      <w:r>
+        <w:t>大家更喜欢哪一种表达方式表达出来的感觉？为什么？</w:t>
+      </w:r>
+    </w:p>
+    <w:p>
+      <w:r>
+        <w:t>七、采访</w:t>
+      </w:r>
+    </w:p>
+    <w:p>
+      <w:pPr>
+        <w:spacing w:after="60"/>
+      </w:pPr>
+      <w:r>
+        <w:t>1、没有学习前你平常用哪一种方式给家人表达的最多，第一种还是第二种？</w:t>
+      </w:r>
+    </w:p>
+    <w:p>
+      <w:pPr>
+        <w:spacing w:after="60"/>
+      </w:pPr>
+      <w:r>
+        <w:t>2、获得了一个什么样的结果？</w:t>
+      </w:r>
+    </w:p>
+    <w:p>
+      <w:pPr>
+        <w:spacing w:after="60"/>
+      </w:pPr>
+      <w:r>
+        <w:t>3、当时发生了什么事？（简单讲一个自己的案例）</w:t>
+      </w:r>
+    </w:p>
+    <w:p>
+      <w:pPr>
+        <w:spacing w:after="60"/>
+      </w:pPr>
+      <w:r>
+        <w:t>4、出现问题后都怎么解决了，解决效果怎么样？</w:t>
+      </w:r>
+    </w:p>
+    <w:p>
+      <w:pPr>
+        <w:spacing w:after="60"/>
+      </w:pPr>
+      <w:r>
+        <w:t>5、如果到现在还没有参加过这样的学习，错误的方式持续下去会出现什么样的后果？</w:t>
+      </w:r>
+    </w:p>
+    <w:p>
+      <w:pPr>
+        <w:spacing w:after="60"/>
+      </w:pPr>
+      <w:r>
+        <w:t>6、这样的结果是你想要的吗？如果不想要，正确的做法，我们应该怎么做呢？（答案让对方说出来）</w:t>
+      </w:r>
+    </w:p>
+    <w:p>
+      <w:r>
+        <w:t>八、闭环</w:t>
+      </w:r>
+    </w:p>
+    <w:p>
+      <w:pPr>
+        <w:spacing w:after="60"/>
+      </w:pPr>
+      <w:r>
+        <w:t>1.闭环到正确的做法</w:t>
+      </w:r>
+    </w:p>
+    <w:p>
+      <w:r>
+        <w:t>要不要持续坚持用这种看优点的视角和表达方式，跟我们身边的人好好交流。</w:t>
+      </w:r>
+    </w:p>
+    <w:p>
+      <w:pPr>
+        <w:spacing w:after="60"/>
+      </w:pPr>
+      <w:r>
+        <w:t>2.闭环到持续学习</w:t>
+      </w:r>
+    </w:p>
+    <w:p>
+      <w:r>
+        <w:t>我们以后要不要持续学习，让自己成为一个高情商的人，成为一个会发现幸福，创造幸福的人。</w:t>
+      </w:r>
+    </w:p>
+    <w:p>
+      <w:r>
+        <w:t>学习结束留作业</w:t>
+      </w:r>
+    </w:p>
+    <w:p>
+      <w:r>
+        <w:t>用今天学到的方式至少给一到两个家人进行实践，最好是先给自己的爱人实践，然后才是孩子及其他家人。</w:t>
+      </w:r>
+    </w:p>
+    <w:p>
+      <w:r>
+        <w:t>实践完及时在群里反馈结果，如果效果不理想，及时找到群主复盘，找到原因并帮助解决，坚决不能让不好的因素继续影响家庭幸福。</w:t>
+      </w:r>
+    </w:p>
+    <w:p>
+      <w:r>
+        <w:t>收作业</w:t>
+      </w:r>
+    </w:p>
+    <w:p>
+      <w:r>
+        <w:t>群主记得收作业，不按时完成作业，学习态度不端正的，默认不需要幸福，不重视家庭，对家庭不负责任，按照规则抱出群取消学习机会。</w:t>
+      </w:r>
+    </w:p>
+    <w:p>
+      <w:r>
+        <w:t>正式训练第2天</w:t>
+      </w:r>
+    </w:p>
+    <w:p>
+      <w:r>
+        <w:t>（重点：让学习者人人参与进来）</w:t>
+      </w:r>
+    </w:p>
+    <w:p>
+      <w:r>
+        <w:t>一、破冰</w:t>
+      </w:r>
+    </w:p>
+    <w:p>
+      <w:r>
+        <w:t>有的人相处如沐春风，可有的人一见面两句话就抬杠，经常不欢而散。</w:t>
+      </w:r>
+    </w:p>
+    <w:p>
+      <w:r>
+        <w:t>这到底是哪里的问题？</w:t>
+      </w:r>
+    </w:p>
+    <w:p>
+      <w:r>
+        <w:t>别着急，一个公式让你秒变高情商的人，甚至挑毛病对方都会欣然接受！</w:t>
+      </w:r>
+    </w:p>
+    <w:p>
+      <w:r>
+        <w:t>到底是什么公司有这么大的威力？</w:t>
+      </w:r>
+    </w:p>
+    <w:p>
+      <w:r>
+        <w:t>想知道的家人，明天上午9点腾讯会议，不见不散！</w:t>
+      </w:r>
+    </w:p>
+    <w:p>
+      <w:r>
+        <w:t>二、榜样采访</w:t>
+      </w:r>
+    </w:p>
+    <w:p>
+      <w:r>
+        <w:t>采访头一天的榜样，有突破的就让她来做两三分钟的分享（避免话停不下来的人，提前给她简单梳理一下，按照下面发问，三分钟左右精准分享）</w:t>
+      </w:r>
+    </w:p>
+    <w:p>
+      <w:pPr>
+        <w:spacing w:after="60"/>
+      </w:pPr>
+      <w:r>
+        <w:t>1.简单破冰引出榜样邀请这个人出来分享前，根据她的突破结果，简单精准一句话做个破冰，然后再邀请她出来分享</w:t>
+      </w:r>
+    </w:p>
+    <w:p>
+      <w:pPr>
+        <w:spacing w:after="60"/>
+      </w:pPr>
+      <w:r>
+        <w:t>2.分享标准发问</w:t>
+      </w:r>
+    </w:p>
+    <w:p>
+      <w:r>
+        <w:t>①昨天学习后给家里哪个人表达了？当时是什么样的场景，家人给了一个什么样的反馈？自己有什么样的感触？</w:t>
+      </w:r>
+    </w:p>
+    <w:p>
+      <w:r>
+        <w:t>②遇见同样的问题，困扰多久了，以前是怎么解决的？得到了个什么结果？</w:t>
+      </w:r>
+    </w:p>
+    <w:p>
+      <w:r>
+        <w:t>③这样的学习效果，学习方式你是否满意？是否喜欢？</w:t>
+      </w:r>
+    </w:p>
+    <w:p>
+      <w:pPr>
+        <w:spacing w:after="60"/>
+      </w:pPr>
+      <w:r>
+        <w:t>3.分享完，主持人简单总结两句，引出发心语言我们又帮到了一个家庭，又少了一个被家庭内耗伤害的人，感受到了开幸福训练营的意义，更有动力继续开下去</w:t>
+      </w:r>
+    </w:p>
+    <w:p>
+      <w:r>
+        <w:t>例：只是说对了一句话，家里的氛围却变了</w:t>
+      </w:r>
+    </w:p>
+    <w:p>
+      <w:r>
+        <w:t>例：只是给老公说了一句话，成天冷冰冰的老公却笑了等等</w:t>
+      </w:r>
+    </w:p>
+    <w:p>
+      <w:r>
+        <w:t>操作提示：</w:t>
+      </w:r>
+    </w:p>
+    <w:p>
+      <w:r>
+        <w:t>主持人能量语言贯穿始终，随时随地注意点评所有参与者。</w:t>
+      </w:r>
+    </w:p>
+    <w:p>
+      <w:r>
+        <w:t>三、热场</w:t>
+      </w:r>
+    </w:p>
+    <w:p>
+      <w:r>
+        <w:t>大家好，我们家里的电器要打开开关才能使用，对吗？那我们的身体里的五脏六腑的工作模式也是有开关的，你们知道吗？为了我们越来越健康，现在打开我们的身体五脏六腑的开关，我们一起来完成开心八式，请大家起立。</w:t>
+      </w:r>
+    </w:p>
+    <w:p>
+      <w:r>
+        <w:t>要点：开心八式</w:t>
+      </w:r>
+    </w:p>
+    <w:p>
+      <w:r>
+        <w:t>眼睛微闭，用心的拍，开心的拍，越拍越痛，越痛越通，越通越轻松。</w:t>
+      </w:r>
+    </w:p>
+    <w:p>
+      <w:r>
+        <w:t>①腋窝--疏肝理气，我不生气；</w:t>
+      </w:r>
+    </w:p>
+    <w:p>
+      <w:r>
+        <w:t>②肘窝--心肺安宁，不悲不喜；</w:t>
+      </w:r>
+    </w:p>
+    <w:p>
+      <w:r>
+        <w:t>③股沟--脾胃健康，无忧无虑；</w:t>
+      </w:r>
+    </w:p>
+    <w:p>
+      <w:r>
+        <w:t>④膝窝--肾气充盈，不惊不惧。</w:t>
+      </w:r>
+    </w:p>
+    <w:p>
+      <w:r>
+        <w:t>四、提要求</w:t>
+      </w:r>
+    </w:p>
+    <w:p>
+      <w:r>
+        <w:t>大家想早一天解决问题，还是晚一天解决问题？大家想早一天幸福，还是晚一天幸福？最好的办法就是一定要按照标准参与。</w:t>
+      </w:r>
+    </w:p>
+    <w:p>
+      <w:pPr>
+        <w:spacing w:after="60"/>
+      </w:pPr>
+      <w:r>
+        <w:t>1.学习中间不要走开，尽量全程参与。</w:t>
+      </w:r>
+    </w:p>
+    <w:p>
+      <w:pPr>
+        <w:spacing w:after="60"/>
+      </w:pPr>
+      <w:r>
+        <w:t>2.每个人都参与进来（看别人炒菜和自己动手炒菜，谁学会的更快）</w:t>
+      </w:r>
+    </w:p>
+    <w:p>
+      <w:pPr>
+        <w:spacing w:after="60"/>
+      </w:pPr>
+      <w:r>
+        <w:t>3.学习过程中不要接打电话，以免耽误自己学习。</w:t>
+      </w:r>
+    </w:p>
+    <w:p>
+      <w:r>
+        <w:t>五、主题主题：高情商说话方式</w:t>
+      </w:r>
+    </w:p>
+    <w:p>
+      <w:r>
+        <w:t>（重点：让学习者人人参与进来）</w:t>
+      </w:r>
+    </w:p>
+    <w:p>
+      <w:pPr>
+        <w:spacing w:after="60"/>
+      </w:pPr>
+      <w:r>
+        <w:t>1.互动游戏：虽然+但是（重点，让学习者人人参与进来）</w:t>
+      </w:r>
+    </w:p>
+    <w:p>
+      <w:r>
+        <w:t>找出一个朋友（发小，闺蜜，同学）</w:t>
+      </w:r>
+    </w:p>
+    <w:p>
+      <w:pPr>
+        <w:spacing w:after="60"/>
+      </w:pPr>
+      <w:r>
+        <w:t>2.分别找到一个优点，再找到他的一个缺点，写出来，然后在会议室两人结对相互演练表达</w:t>
+      </w:r>
+    </w:p>
+    <w:p>
       <w:r>
         <w:t>①先用“虽然+优点，但是+缺点”的方式表达一遍</w:t>
       </w:r>
@@ -4853,41 +5353,338 @@
     </w:p>
     <w:p>
       <w:r>
+        <w:t>听到这种表达方式，有一种什么样的感觉？</w:t>
+      </w:r>
+    </w:p>
+    <w:p>
+      <w:r>
+        <w:t>六、分享</w:t>
+      </w:r>
+    </w:p>
+    <w:p>
+      <w:r>
+        <w:t>大家更喜哪一种表达方式表达出来的感觉？</w:t>
+      </w:r>
+    </w:p>
+    <w:p>
+      <w:r>
+        <w:t>为什么？（鸡屁股生什么？鸡屎还是鸡蛋？）</w:t>
+      </w:r>
+    </w:p>
+    <w:p>
+      <w:r>
+        <w:t>七、采访</w:t>
+      </w:r>
+    </w:p>
+    <w:p>
+      <w:r>
+        <w:t>①以前你跟你的同学，朋友都是用什么样的表达方式？以前的那种表达方式跟今天学习的这种表达方式，你觉得哪一种更能增加你们之间的感情？哪一种让你觉得人跟人之间更温暖？</w:t>
+      </w:r>
+    </w:p>
+    <w:p>
+      <w:r>
+        <w:t>从小到大有没有因为你的心直口快，不小心说了重话伤到朋友的场景，如果有请你说一个。</w:t>
+      </w:r>
+    </w:p>
+    <w:p>
+      <w:r>
+        <w:t>②如果我们到现在也没有学会今天这种表达方式，一直都是随心所欲，随意任性表达，有没有发现现在人跟人之间的感情越来越淡薄？</w:t>
+      </w:r>
+    </w:p>
+    <w:p>
+      <w:r>
+        <w:t>真心的朋友好像越来越少，人心跟人心之间的距离越来越远，这样淡漠的生活环境，是我们大家想要的吗？</w:t>
+      </w:r>
+    </w:p>
+    <w:p>
+      <w:r>
+        <w:t>③如果我们想要跟朋友发小之间的关系越来越亲近，人跟人之间越来越有温度的相处，正确的做法我们应该怎么做呢？（答案让对方说出来）</w:t>
+      </w:r>
+    </w:p>
+    <w:p>
+      <w:r>
+        <w:t>八、闭环</w:t>
+      </w:r>
+    </w:p>
+    <w:p>
+      <w:pPr>
+        <w:spacing w:after="60"/>
+      </w:pPr>
+      <w:r>
+        <w:t>1.闭环到正确的做法</w:t>
+      </w:r>
+    </w:p>
+    <w:p>
+      <w:r>
+        <w:t>要不要持续坚持用这种看优点的视角和表达方式，跟我们身边的人好好交流。</w:t>
+      </w:r>
+    </w:p>
+    <w:p>
+      <w:pPr>
+        <w:spacing w:after="60"/>
+      </w:pPr>
+      <w:r>
+        <w:t>2.闭环到持续学习</w:t>
+      </w:r>
+    </w:p>
+    <w:p>
+      <w:r>
+        <w:t>我们以后要不要持续学习，让自己成为一个高情商的人，成为一个会发现幸福，创造幸福的人。</w:t>
+      </w:r>
+    </w:p>
+    <w:p>
+      <w:r>
+        <w:t>学习结束留作业</w:t>
+      </w:r>
+    </w:p>
+    <w:p>
+      <w:r>
+        <w:t>用今天学到的方式至少给一到两个朋友进行实践，实践完及时在群里反馈结果，如果效果不理想,及时找到群主复盘找到原因并帮助解决，持续为做一个幸福的人而坚持。</w:t>
+      </w:r>
+    </w:p>
+    <w:p>
+      <w:r>
+        <w:t>收作业</w:t>
+      </w:r>
+    </w:p>
+    <w:p>
+      <w:r>
+        <w:t>群主记得收作业，不按时完成作业，学习态度不端正的，默认不需要幸福，不重视家庭，对家庭不负责任,抱出群取消学习机会。</w:t>
+      </w:r>
+    </w:p>
+    <w:p>
+      <w:r>
+        <w:t>受益顾客交作业的标准：</w:t>
+      </w:r>
+    </w:p>
+    <w:p>
+      <w:r>
+        <w:t>今天你给哪一个家人表达了，在什么场景下用的？你当时说了一段什么样的话，你的家人给了你什么样的一个反应或者反馈？</w:t>
+      </w:r>
+    </w:p>
+    <w:p>
+      <w:r>
+        <w:t>正式训练第3天</w:t>
+      </w:r>
+    </w:p>
+    <w:p>
+      <w:r>
+        <w:t>互动游戏（找优点-辛苦和不容易）</w:t>
+      </w:r>
+    </w:p>
+    <w:p>
+      <w:r>
+        <w:t>（重点：让学习者人人参与进来）</w:t>
+      </w:r>
+    </w:p>
+    <w:p>
+      <w:r>
+        <w:t>一、破冰</w:t>
+      </w:r>
+    </w:p>
+    <w:p>
+      <w:r>
+        <w:t>一个大姐，买菜、做饭、打扫卫生，却得不到老公一句认可，心里委屈痛苦不堪，差点走到婚姻的边缘。</w:t>
+      </w:r>
+    </w:p>
+    <w:p>
+      <w:r>
+        <w:t>没想到做对了一个动作，老公买菜做饭，还抢着干活，现在夫妻俩回到了谈恋爱的感觉，家里欢声笑语不断。</w:t>
+      </w:r>
+    </w:p>
+    <w:p>
+      <w:r>
+        <w:t>到底什么动作有这么大的魅力？就像变魔术一样。</w:t>
+      </w:r>
+    </w:p>
+    <w:p>
+      <w:r>
+        <w:t>想知道的家人，明天的幸福训练营第三天，不见不散！</w:t>
+      </w:r>
+    </w:p>
+    <w:p>
+      <w:r>
+        <w:t>二、榜样采访</w:t>
+      </w:r>
+    </w:p>
+    <w:p>
+      <w:r>
+        <w:t>采访头一天的榜样，有突破的就让她来做两三分钟的分享（避免话停不下来的人，提前给她简单梳理一下，按照下面发问，三分钟左右精准分享）</w:t>
+      </w:r>
+    </w:p>
+    <w:p>
+      <w:pPr>
+        <w:spacing w:after="60"/>
+      </w:pPr>
+      <w:r>
+        <w:t>1.简单破冰引出榜样邀请这个人出来分享前，根据她的突破结果，简单精准一句话做个破冰，然后再邀请她出来分享</w:t>
+      </w:r>
+    </w:p>
+    <w:p>
+      <w:pPr>
+        <w:spacing w:after="60"/>
+      </w:pPr>
+      <w:r>
+        <w:t>2.分享标准发问</w:t>
+      </w:r>
+    </w:p>
+    <w:p>
+      <w:r>
+        <w:t>①昨天学习后给家里哪个人表达了？当时是什么样的场景，家人给了一个什么样的反馈？自己有什么样的感触？</w:t>
+      </w:r>
+    </w:p>
+    <w:p>
+      <w:r>
+        <w:t>②遇见同样的问题，困扰多久了，以前是怎么解决的？得到了个什么结果？</w:t>
+      </w:r>
+    </w:p>
+    <w:p>
+      <w:r>
+        <w:t>③这样的学习效果，学习方式你是否满意？是否喜欢？</w:t>
+      </w:r>
+    </w:p>
+    <w:p>
+      <w:pPr>
+        <w:spacing w:after="60"/>
+      </w:pPr>
+      <w:r>
+        <w:t>3.分享完主持人简单总结两句，引出发心语言我们又帮到了一个家庭，又少了一个被家庭内耗伤害的人。感受到了开幸福训练营的意义，更有动力继续开下去</w:t>
+      </w:r>
+    </w:p>
+    <w:p>
+      <w:r>
+        <w:t>例：只是说对了一句话，家里的氛围却变了</w:t>
+      </w:r>
+    </w:p>
+    <w:p>
+      <w:r>
+        <w:t>例：只是给老公说了一句话，成天冷冰冰的老公却笑了等等</w:t>
+      </w:r>
+    </w:p>
+    <w:p>
+      <w:r>
         <w:t>操作提示：</w:t>
       </w:r>
     </w:p>
     <w:p>
-      <w:pPr>
-        <w:spacing w:after="60"/>
-      </w:pPr>
-      <w:r>
-        <w:t>1.先把“虽然+优点，但是+缺点”公式打出来</w:t>
-      </w:r>
-    </w:p>
-    <w:p>
-      <w:pPr>
-        <w:spacing w:after="60"/>
-      </w:pPr>
-      <w:r>
-        <w:t>2.要表达出感受，而不是情绪3.先问两个人写的是谁？</w:t>
-      </w:r>
-    </w:p>
-    <w:p>
-      <w:r>
-        <w:t>4.</w:t>
-      </w:r>
-    </w:p>
-    <w:p>
-      <w:pPr>
-        <w:spacing w:after="60"/>
-      </w:pPr>
-      <w:r>
-        <w:t>4.后面是缺点时，你的心情好不好？</w:t>
-      </w:r>
-    </w:p>
-    <w:p>
-      <w:r>
-        <w:t>后面是优点时，你的心情怎么样？</w:t>
+      <w:r>
+        <w:t>主持人能量语言贯穿始终，随时随地注意点评所有参与者。</w:t>
+      </w:r>
+    </w:p>
+    <w:p>
+      <w:r>
+        <w:t>三、热场</w:t>
+      </w:r>
+    </w:p>
+    <w:p>
+      <w:r>
+        <w:t>大家好，我们家里的电器要打开开关才能使用，对吗？那我们的身体里的五脏六腑的工作模式也是有开关的，你们知道吗？为了我们越来越健康，现在打开我们的身体五脏六腑的开关，我们一起来完成开心八式，请大家起立。</w:t>
+      </w:r>
+    </w:p>
+    <w:p>
+      <w:r>
+        <w:t>要点：开心八式</w:t>
+      </w:r>
+    </w:p>
+    <w:p>
+      <w:r>
+        <w:t>眼睛微闭，用心的拍，开心的拍，越拍越痛，越痛越通，越通越轻松。</w:t>
+      </w:r>
+    </w:p>
+    <w:p>
+      <w:r>
+        <w:t>①腋窝--疏肝理气，我不生气；</w:t>
+      </w:r>
+    </w:p>
+    <w:p>
+      <w:r>
+        <w:t>②肘窝--心肺安宁，不悲不喜；</w:t>
+      </w:r>
+    </w:p>
+    <w:p>
+      <w:r>
+        <w:t>③股沟--脾胃健康，无忧无虑；</w:t>
+      </w:r>
+    </w:p>
+    <w:p>
+      <w:r>
+        <w:t>④膝窝--肾气充盈，不惊不惧。</w:t>
+      </w:r>
+    </w:p>
+    <w:p>
+      <w:r>
+        <w:t>四、提要求</w:t>
+      </w:r>
+    </w:p>
+    <w:p>
+      <w:r>
+        <w:t>大家想早一天解决问题，还是晚一天解决问题？大家想早一天幸福，还是晚一天幸福？最好的办法就是一定要按照标准参与。</w:t>
+      </w:r>
+    </w:p>
+    <w:p>
+      <w:pPr>
+        <w:spacing w:after="60"/>
+      </w:pPr>
+      <w:r>
+        <w:t>1.学习中间不要走开，尽量全程参与。</w:t>
+      </w:r>
+    </w:p>
+    <w:p>
+      <w:pPr>
+        <w:spacing w:after="60"/>
+      </w:pPr>
+      <w:r>
+        <w:t>2.每个人都参与进来（看别人炒菜和自己动手炒菜，谁学会的更快）。</w:t>
+      </w:r>
+    </w:p>
+    <w:p>
+      <w:pPr>
+        <w:spacing w:after="60"/>
+      </w:pPr>
+      <w:r>
+        <w:t>3.学习过程中不要接打电话。以免耽误自己学习。</w:t>
+      </w:r>
+    </w:p>
+    <w:p>
+      <w:r>
+        <w:t>五、主题</w:t>
+      </w:r>
+    </w:p>
+    <w:p>
+      <w:pPr>
+        <w:spacing w:after="60"/>
+      </w:pPr>
+      <w:r>
+        <w:t>1.游戏规则：找一个家人（爱人，父母，孩子，婆婆，媳妇儿）</w:t>
+      </w:r>
+    </w:p>
+    <w:p>
+      <w:pPr>
+        <w:spacing w:after="60"/>
+      </w:pPr>
+      <w:r>
+        <w:t>2.找到他（她）的1-2个优点写出来（提前准备好优点清单）</w:t>
+      </w:r>
+    </w:p>
+    <w:p>
+      <w:pPr>
+        <w:spacing w:after="60"/>
+      </w:pPr>
+      <w:r>
+        <w:t>3.再用一个具体场景来描述呈现它的这个优点，简单写出来</w:t>
+      </w:r>
+    </w:p>
+    <w:p>
+      <w:r>
+        <w:t>【重点是写出对方的辛苦和不容易，因为看见别人的辛苦和不容易会幸福，看见自己的辛苦和不容易会痛苦】</w:t>
+      </w:r>
+    </w:p>
+    <w:p>
+      <w:pPr>
+        <w:spacing w:after="60"/>
+      </w:pPr>
+      <w:r>
+        <w:t>4.写完后，会议室结对子，两两互练（假设自己要表达的那个人就在眼前），用第一人称现场模拟演示自己的优点加场景。</w:t>
       </w:r>
     </w:p>
     <w:p>
@@ -4897,12 +5694,7 @@
     </w:p>
     <w:p>
       <w:r>
-        <w:t>每个人再简单分享一下，听到这种表达方式，有一种什么样的感觉？</w:t>
-      </w:r>
-    </w:p>
-    <w:p>
-      <w:r>
-        <w:t>大家更喜欢哪一种表达方式表达出来的感觉？为什么？</w:t>
+        <w:t>每个人再简单分享一下今天的对练,有一种什么样的感受？</w:t>
       </w:r>
     </w:p>
     <w:p>
@@ -4911,51 +5703,38 @@
       </w:r>
     </w:p>
     <w:p>
-      <w:pPr>
-        <w:spacing w:after="60"/>
-      </w:pPr>
-      <w:r>
-        <w:t>1、没有学习前你平常用哪一种方式给家人表达的最多，第一种还是第二种？</w:t>
-      </w:r>
-    </w:p>
-    <w:p>
-      <w:pPr>
-        <w:spacing w:after="60"/>
-      </w:pPr>
-      <w:r>
-        <w:t>2、获得了一个什么样的结果？</w:t>
-      </w:r>
-    </w:p>
-    <w:p>
-      <w:pPr>
-        <w:spacing w:after="60"/>
-      </w:pPr>
-      <w:r>
-        <w:t>3、当时发生了什么事？（简单讲一个自己的案例）</w:t>
-      </w:r>
-    </w:p>
-    <w:p>
-      <w:pPr>
-        <w:spacing w:after="60"/>
-      </w:pPr>
-      <w:r>
-        <w:t>4、出现问题后都怎么解决了，解决效果怎么样？</w:t>
-      </w:r>
-    </w:p>
-    <w:p>
-      <w:pPr>
-        <w:spacing w:after="60"/>
-      </w:pPr>
-      <w:r>
-        <w:t>5、如果到现在还没有参加过这样的学习，错误的方式持续下去会出现什么样的后果？</w:t>
-      </w:r>
-    </w:p>
-    <w:p>
-      <w:pPr>
-        <w:spacing w:after="60"/>
-      </w:pPr>
-      <w:r>
-        <w:t>6、这样的结果是你想要的吗？如果不想要，正确的做法，我们应该怎么做呢？（答案让对方说出来）</w:t>
+      <w:r>
+        <w:t>互动讨论</w:t>
+      </w:r>
+    </w:p>
+    <w:p>
+      <w:r>
+        <w:t>①没有学习前你平常用哪一种方式给家人表达的最多，是看到优点说出来，还是看到缺点说出来？</w:t>
+      </w:r>
+    </w:p>
+    <w:p>
+      <w:r>
+        <w:t>获得了一个什么样的结果？</w:t>
+      </w:r>
+    </w:p>
+    <w:p>
+      <w:r>
+        <w:t>②当时发生了什么事（简单讲一个自己的案例）</w:t>
+      </w:r>
+    </w:p>
+    <w:p>
+      <w:r>
+        <w:t>③出现问题后都怎么解决了，解决效果怎么样</w:t>
+      </w:r>
+    </w:p>
+    <w:p>
+      <w:r>
+        <w:t>④如果到现在还没有参加过这样的学习，错误的方式持续下去会出现什么样的后果？这样的结果是你想要的吗？</w:t>
+      </w:r>
+    </w:p>
+    <w:p>
+      <w:r>
+        <w:t>⑤如果不想要正确的做法，我们应该怎么做呢？（引导对方说出来、在闭环里）</w:t>
       </w:r>
     </w:p>
     <w:p>
@@ -4973,7 +5752,12 @@
     </w:p>
     <w:p>
       <w:r>
-        <w:t>要不要持续坚持用这种看优点的视角和表达方式，跟我们身边的人好好交流。</w:t>
+        <w:t>①看正面放负面，多看优点并表达出来</w:t>
+      </w:r>
+    </w:p>
+    <w:p>
+      <w:r>
+        <w:t>②允许每个人有缺点存在，因为我们自己也有很多缺点。</w:t>
       </w:r>
     </w:p>
     <w:p>
@@ -4986,7 +5770,7 @@
     </w:p>
     <w:p>
       <w:r>
-        <w:t>我们以后要不要持续学习，让自己成为一个高情商的人，成为一个会发现幸福，创造幸福的人。</w:t>
+        <w:t>幸福是一阵子的事儿，还是一辈子的事儿？所以坚持持续学习，有没有必要？</w:t>
       </w:r>
     </w:p>
     <w:p>
@@ -4996,12 +5780,7 @@
     </w:p>
     <w:p>
       <w:r>
-        <w:t>用今天学到的方式至少给一到两个家人进行实践，最好是先给自己的爱人实践，然后才是孩子及其他家人。</w:t>
-      </w:r>
-    </w:p>
-    <w:p>
-      <w:r>
-        <w:t>实践完及时在群里反馈结果，如果效果不理想，及时找到群主复盘，找到原因并帮助解决，坚决不能让不好的因素继续影响家庭幸福。</w:t>
+        <w:t>用今天学到的方式至少给一到两个家人进行实践点评，最好是先给自己的爱人实践，然后才是孩子及其他家人，实践完及时在群里反馈结果，如果效果不理想及时找到群主复盘找到原因并帮助解决，坚决不能让不好的因素继续影响家庭幸福。</w:t>
       </w:r>
     </w:p>
     <w:p>
@@ -5011,17 +5790,37 @@
     </w:p>
     <w:p>
       <w:r>
-        <w:t>群主记得收作业，不按时完成作业，学习态度不端正的，默认不需要幸福，不重视家庭，对家庭不负责任，按照规则抱出群取消学习机会。</w:t>
-      </w:r>
-    </w:p>
-    <w:p>
-      <w:r>
-        <w:t>正式训练第2天</w:t>
-      </w:r>
-    </w:p>
-    <w:p>
-      <w:r>
-        <w:t>（重点：让学习者人人参与进来）</w:t>
+        <w:t>群主记得收作业，不按时完成作业，学习态度不端正的，默认不需要幸福，不重视家庭，对家庭不负责任，抱出群取消学习机会。</w:t>
+      </w:r>
+    </w:p>
+    <w:p>
+      <w:r>
+        <w:t>给予深度点评和梳理，给方向给希望，做深度陪伴，点评出有价值的有意义的（大春老师点评抽离出规律才显示出来分享的价值），点评他的成长，他的行为背后的意义。</w:t>
+      </w:r>
+    </w:p>
+    <w:p>
+      <w:r>
+        <w:t>受益顾客交作业的标准：</w:t>
+      </w:r>
+    </w:p>
+    <w:p>
+      <w:r>
+        <w:t>今天你给哪一个家人表达了，在什么场景下用的？你当时说了一段什么样的话，你的家人给了你什么样的一个反应或者反馈？</w:t>
+      </w:r>
+    </w:p>
+    <w:p>
+      <w:r>
+        <w:t>正式训练第4天</w:t>
+      </w:r>
+    </w:p>
+    <w:p>
+      <w:r>
+        <w:t>互动游戏找优点-辛苦和不容易（提前准备好优点清单）</w:t>
+      </w:r>
+    </w:p>
+    <w:p>
+      <w:r>
+        <w:t>（每一个参加学习的人都要参加进来）</w:t>
       </w:r>
     </w:p>
     <w:p>
@@ -5031,27 +5830,22 @@
     </w:p>
     <w:p>
       <w:r>
-        <w:t>有的人相处如沐春风，可有的人一见面两句话就抬杠，经常不欢而散。</w:t>
-      </w:r>
-    </w:p>
-    <w:p>
-      <w:r>
-        <w:t>这到底是哪里的问题？</w:t>
-      </w:r>
-    </w:p>
-    <w:p>
-      <w:r>
-        <w:t>别着急，一个公式让你秒变高情商的人，甚至挑毛病对方都会欣然接受！</w:t>
-      </w:r>
-    </w:p>
-    <w:p>
-      <w:r>
-        <w:t>到底是什么公司有这么大的威力？</w:t>
-      </w:r>
-    </w:p>
-    <w:p>
-      <w:r>
-        <w:t>想知道的家人，明天上午9点腾讯会议，不见不散！</w:t>
+        <w:t>一个小姐姐，平时对人很好，也喜欢帮忙，可就是不招人喜欢，很是郁闷。</w:t>
+      </w:r>
+    </w:p>
+    <w:p>
+      <w:r>
+        <w:t>没想到做对了一个动作，身边人都喜欢和她在一起，现在成了人人都喜欢的蜜姐。</w:t>
+      </w:r>
+    </w:p>
+    <w:p>
+      <w:r>
+        <w:t>想知道他做对了什么动作，这么大的魅力吗？</w:t>
+      </w:r>
+    </w:p>
+    <w:p>
+      <w:r>
+        <w:t>想知道的家人，明天腾讯会议不见不散！</w:t>
       </w:r>
     </w:p>
     <w:p>
@@ -5061,6 +5855,332 @@
     </w:p>
     <w:p>
       <w:r>
+        <w:t>采访头一天的榜样有突破的就让她来做两三分钟的分享（避免话停不下来的人，提前给她简单梳理一下，按照下面发问，三分钟左右精准分享）</w:t>
+      </w:r>
+    </w:p>
+    <w:p>
+      <w:pPr>
+        <w:spacing w:after="60"/>
+      </w:pPr>
+      <w:r>
+        <w:t>1.简单破冰引出榜样邀请这个人出来分享前，根据她的突破结果，简单精准一句话做个破冰，然后再邀请她出来分享</w:t>
+      </w:r>
+    </w:p>
+    <w:p>
+      <w:pPr>
+        <w:spacing w:after="60"/>
+      </w:pPr>
+      <w:r>
+        <w:t>2.分享标准发问</w:t>
+      </w:r>
+    </w:p>
+    <w:p>
+      <w:r>
+        <w:t>①昨天学习后给家里哪个人表达了？当时是什么样的场景，家人给了一个什么样的反馈？自己有什么样的感触？</w:t>
+      </w:r>
+    </w:p>
+    <w:p>
+      <w:r>
+        <w:t>②遇见同样的问题，困扰多久了，以前是怎么解决的？得到了个什么结果？</w:t>
+      </w:r>
+    </w:p>
+    <w:p>
+      <w:r>
+        <w:t>③这样的学习效果，学习方式你是否满意？是否喜欢？</w:t>
+      </w:r>
+    </w:p>
+    <w:p>
+      <w:pPr>
+        <w:spacing w:after="60"/>
+      </w:pPr>
+      <w:r>
+        <w:t>3.分享完主持人简单总结两句，引出发心语言我们又帮到了一个家庭，又少了一个被家庭内耗伤害的人。感受到了开幸福训练营的意义，更有动力继续开下去</w:t>
+      </w:r>
+    </w:p>
+    <w:p>
+      <w:r>
+        <w:t>例：只是说对了一句话，家里的氛围却变了</w:t>
+      </w:r>
+    </w:p>
+    <w:p>
+      <w:r>
+        <w:t>例：只是给老公说了一句话，成天冷冰冰的老公却笑了等等</w:t>
+      </w:r>
+    </w:p>
+    <w:p>
+      <w:r>
+        <w:t>操作提示：</w:t>
+      </w:r>
+    </w:p>
+    <w:p>
+      <w:r>
+        <w:t>主持人能量语言贯穿始终，随时随地注意点评所有参与者。</w:t>
+      </w:r>
+    </w:p>
+    <w:p>
+      <w:r>
+        <w:t>三、热场</w:t>
+      </w:r>
+    </w:p>
+    <w:p>
+      <w:r>
+        <w:t>大家好，我们家里的电器要打开开关才能使用，对吗？那我们的身体里的五脏六腑的工作模式也是有开关的，你们知道吗？为了我们越来越健康，现在打开我们的身体五脏六腑的开关，我们一起来完成开心八式，请大家起立。</w:t>
+      </w:r>
+    </w:p>
+    <w:p>
+      <w:r>
+        <w:t>要点：开心八式</w:t>
+      </w:r>
+    </w:p>
+    <w:p>
+      <w:r>
+        <w:t>眼睛微闭，用心的拍，开心的拍，越拍越痛，越痛越通，越通越轻松。</w:t>
+      </w:r>
+    </w:p>
+    <w:p>
+      <w:r>
+        <w:t>①腋窝--疏肝理气，我不生气；</w:t>
+      </w:r>
+    </w:p>
+    <w:p>
+      <w:r>
+        <w:t>②肘窝--心肺安宁，不悲不喜；</w:t>
+      </w:r>
+    </w:p>
+    <w:p>
+      <w:r>
+        <w:t>③股沟--脾胃健康，无忧无虑；</w:t>
+      </w:r>
+    </w:p>
+    <w:p>
+      <w:r>
+        <w:t>④膝窝--肾气充盈，不惊不惧。</w:t>
+      </w:r>
+    </w:p>
+    <w:p>
+      <w:r>
+        <w:t>四、提要求</w:t>
+      </w:r>
+    </w:p>
+    <w:p>
+      <w:r>
+        <w:t>大家想早一天解决问题，还是晚一天解决问题？</w:t>
+      </w:r>
+    </w:p>
+    <w:p>
+      <w:r>
+        <w:t>大家想早一天幸福，还是晚一天幸福？最好的办法就是一定要按照标准参与。</w:t>
+      </w:r>
+    </w:p>
+    <w:p>
+      <w:pPr>
+        <w:spacing w:after="60"/>
+      </w:pPr>
+      <w:r>
+        <w:t>1.学习中间不要走开，尽量全程参与。</w:t>
+      </w:r>
+    </w:p>
+    <w:p>
+      <w:pPr>
+        <w:spacing w:after="60"/>
+      </w:pPr>
+      <w:r>
+        <w:t>2.每个人都参与进来（看别人炒菜和自己动手炒菜，谁学会的更快）。</w:t>
+      </w:r>
+    </w:p>
+    <w:p>
+      <w:pPr>
+        <w:spacing w:after="60"/>
+      </w:pPr>
+      <w:r>
+        <w:t>3.学习过程中不要接打电话。以免耽误自己学习。</w:t>
+      </w:r>
+    </w:p>
+    <w:p>
+      <w:r>
+        <w:t>五、主题</w:t>
+      </w:r>
+    </w:p>
+    <w:p>
+      <w:pPr>
+        <w:spacing w:after="60"/>
+      </w:pPr>
+      <w:r>
+        <w:t>1.找优点对象：最好的朋友（发小，闺蜜，老同学等等）</w:t>
+      </w:r>
+    </w:p>
+    <w:p>
+      <w:pPr>
+        <w:spacing w:after="60"/>
+      </w:pPr>
+      <w:r>
+        <w:t>2.游戏规则：找到他（她）的1-2个优点写出来</w:t>
+      </w:r>
+    </w:p>
+    <w:p>
+      <w:pPr>
+        <w:spacing w:after="60"/>
+      </w:pPr>
+      <w:r>
+        <w:t>3.再用一个具体场景来描述呈现它的这个优点，简单写出来</w:t>
+      </w:r>
+    </w:p>
+    <w:p>
+      <w:pPr>
+        <w:spacing w:after="60"/>
+      </w:pPr>
+      <w:r>
+        <w:t>4.写完后，会议室结对子，两两互练，假设自己的要表达的那个人就在眼前，用第一人称现场模拟演示自己的优点加场景。</w:t>
+      </w:r>
+    </w:p>
+    <w:p>
+      <w:r>
+        <w:t>六、分享</w:t>
+      </w:r>
+    </w:p>
+    <w:p>
+      <w:r>
+        <w:t>每个人再简单分享一下今天的对练，有一种什么样的感受？为什么？</w:t>
+      </w:r>
+    </w:p>
+    <w:p>
+      <w:r>
+        <w:t>七、采访</w:t>
+      </w:r>
+    </w:p>
+    <w:p>
+      <w:r>
+        <w:t>①你以前跟你的发小闺蜜同学相处，有没有大声向他们表达过他们的优点,以及他们对你的帮助。</w:t>
+      </w:r>
+    </w:p>
+    <w:p>
+      <w:r>
+        <w:t>②通过今天的这种学习，你觉得有没有必要跟他真诚的表达一下他的优点或者曾经对你的帮助，或者曾经感动过你的那些场景，让你们之间的关系更加的亲密</w:t>
+      </w:r>
+    </w:p>
+    <w:p>
+      <w:r>
+        <w:t>③看到优点大声表达出来，让人跟人之间更有温度，咱们的生活是不是就会越来越美好？</w:t>
+      </w:r>
+    </w:p>
+    <w:p>
+      <w:r>
+        <w:t>④人的心不累了，身体是不是也不累了？无论做什么事，是不是都更有动力了？</w:t>
+      </w:r>
+    </w:p>
+    <w:p>
+      <w:r>
+        <w:t>⑤所以你愿意为了让自己的生活更美好而持续学习吗？</w:t>
+      </w:r>
+    </w:p>
+    <w:p>
+      <w:r>
+        <w:t>八、闭环</w:t>
+      </w:r>
+    </w:p>
+    <w:p>
+      <w:pPr>
+        <w:spacing w:after="60"/>
+      </w:pPr>
+      <w:r>
+        <w:t>1.闭环到正确的做法</w:t>
+      </w:r>
+    </w:p>
+    <w:p>
+      <w:r>
+        <w:t>①看正面放负面，多看优点并表达出来</w:t>
+      </w:r>
+    </w:p>
+    <w:p>
+      <w:r>
+        <w:t>②允许每个人有缺点存在，因为我们自己也有很多缺点。</w:t>
+      </w:r>
+    </w:p>
+    <w:p>
+      <w:pPr>
+        <w:spacing w:after="60"/>
+      </w:pPr>
+      <w:r>
+        <w:t>2.闭环到持续学习</w:t>
+      </w:r>
+    </w:p>
+    <w:p>
+      <w:r>
+        <w:t>幸福是一阵子的事儿，还是一辈子的事儿？所以坚持持续学习，有没有必要？</w:t>
+      </w:r>
+    </w:p>
+    <w:p>
+      <w:r>
+        <w:t>学习结束留作业</w:t>
+      </w:r>
+    </w:p>
+    <w:p>
+      <w:r>
+        <w:t>用今天学到的方式至少给一到两个朋友进行实践点评，点评完及时在群里反馈结果，不限时长，不限字数多少，只要真诚点评就可以。如果效果不理想及时找到群主复盘找到原因并帮助解决</w:t>
+      </w:r>
+    </w:p>
+    <w:p>
+      <w:r>
+        <w:t>收作业</w:t>
+      </w:r>
+    </w:p>
+    <w:p>
+      <w:r>
+        <w:t>群主记得收作业，不按时完成作业，学习态度不端正的，默认不需要幸福，不重视家庭，对家庭不负责任，抱出群取消学习机会。</w:t>
+      </w:r>
+    </w:p>
+    <w:p>
+      <w:r>
+        <w:t>受益顾客交作业的标准：</w:t>
+      </w:r>
+    </w:p>
+    <w:p>
+      <w:r>
+        <w:t>今天你给哪一个家人表达了，在什么场景下用的？你当时说了一段什么样的话，你的家人给了你什么样的一个反应或者反馈？</w:t>
+      </w:r>
+    </w:p>
+    <w:p>
+      <w:r>
+        <w:t>正式训练第5天</w:t>
+      </w:r>
+    </w:p>
+    <w:p>
+      <w:r>
+        <w:t>共享陪听第三季智疗第41课《看不到别人的优点，你的人生就会黑暗》</w:t>
+      </w:r>
+    </w:p>
+    <w:p>
+      <w:r>
+        <w:t>一、破冰</w:t>
+      </w:r>
+    </w:p>
+    <w:p>
+      <w:r>
+        <w:t>一个是一个小伙儿，从小性格内向，不爱与人交流，自私自利，父母打电话来还不耐烦、嫌弃，遇事就会卷起身体，像刺猬一样用满身的刺来防御所有的人和事，内心像刀绞一样。</w:t>
+      </w:r>
+    </w:p>
+    <w:p>
+      <w:r>
+        <w:t>却因为走进幸福训练营，7天的时间，就打开了多年的心结，拔掉了身上一根根的刺，跟父母道歉，让爱苏醒。</w:t>
+      </w:r>
+    </w:p>
+    <w:p>
+      <w:r>
+        <w:t>到底他经历了什么，让他有如此巨大的转变？</w:t>
+      </w:r>
+    </w:p>
+    <w:p>
+      <w:r>
+        <w:t>想知道的家人，明天早上9点，腾讯会议，不见不散！</w:t>
+      </w:r>
+    </w:p>
+    <w:p>
+      <w:r>
+        <w:t>二、榜样采访</w:t>
+      </w:r>
+    </w:p>
+    <w:p>
+      <w:r>
         <w:t>采访头一天的榜样，有突破的就让她来做两三分钟的分享（避免话停不下来的人，提前给她简单梳理一下，按照下面发问，三分钟左右精准分享）</w:t>
       </w:r>
     </w:p>
@@ -5069,6 +6189,322 @@
         <w:spacing w:after="60"/>
       </w:pPr>
       <w:r>
+        <w:t>1.简单破冰引出榜样邀请这个人出来分享前，根据她的突破结果，简单精准一句话做个破冰，然后再邀请她出来分享。</w:t>
+      </w:r>
+    </w:p>
+    <w:p>
+      <w:pPr>
+        <w:spacing w:after="60"/>
+      </w:pPr>
+      <w:r>
+        <w:t>2.分享标准发问</w:t>
+      </w:r>
+    </w:p>
+    <w:p>
+      <w:r>
+        <w:t>①昨天学习后给家里哪个人表达了？当时是什么样的场景，家人给了一个什么样的反馈？自己有什么样的感触？</w:t>
+      </w:r>
+    </w:p>
+    <w:p>
+      <w:r>
+        <w:t>②遇见同样的问题，困扰多久了，以前是怎么解决的？得到了个什么结果？</w:t>
+      </w:r>
+    </w:p>
+    <w:p>
+      <w:r>
+        <w:t>③这样的学习效果，学习方式你是否满意？是否喜欢？</w:t>
+      </w:r>
+    </w:p>
+    <w:p>
+      <w:pPr>
+        <w:spacing w:after="60"/>
+      </w:pPr>
+      <w:r>
+        <w:t>3.分享完主持人简单总结两句，引出发心语言我们又帮到了一个家庭，又少了一个被家庭内耗伤害的人。感受到了开幸福训练营的意义，更有动力继续开下去</w:t>
+      </w:r>
+    </w:p>
+    <w:p>
+      <w:r>
+        <w:t>例：只是说对了一句话，家里的氛围却变了例：只是给老公说了一句话，成天冷冰冰的老公却笑了等等</w:t>
+      </w:r>
+    </w:p>
+    <w:p>
+      <w:r>
+        <w:t>操作提示：</w:t>
+      </w:r>
+    </w:p>
+    <w:p>
+      <w:r>
+        <w:t>主持人能量语言贯穿始终，随时随地注意点评所有参与者。</w:t>
+      </w:r>
+    </w:p>
+    <w:p>
+      <w:r>
+        <w:t>三、热场</w:t>
+      </w:r>
+    </w:p>
+    <w:p>
+      <w:r>
+        <w:t>大家好，我们家里的电器要打开开关才能使用，对吗？那我们的身体里的五脏六腑的工作模式也是有开关的，你们知道吗？为了我们越来越健康，现在打开我们的身体五脏六腑的开关，我们一起来完成开心八式，请大家起立。</w:t>
+      </w:r>
+    </w:p>
+    <w:p>
+      <w:r>
+        <w:t>要点：开心八式</w:t>
+      </w:r>
+    </w:p>
+    <w:p>
+      <w:r>
+        <w:t>眼睛微闭，用心的拍，开心的拍，越拍越痛，越痛越通，越通越轻松。</w:t>
+      </w:r>
+    </w:p>
+    <w:p>
+      <w:r>
+        <w:t>①腋窝--疏肝理气，我不生气；</w:t>
+      </w:r>
+    </w:p>
+    <w:p>
+      <w:r>
+        <w:t>②肘窝--心肺安宁，不悲不喜；</w:t>
+      </w:r>
+    </w:p>
+    <w:p>
+      <w:r>
+        <w:t>③股沟--脾胃健康，无忧无虑；</w:t>
+      </w:r>
+    </w:p>
+    <w:p>
+      <w:r>
+        <w:t>④膝窝--肾气充盈，不惊不惧。</w:t>
+      </w:r>
+    </w:p>
+    <w:p>
+      <w:r>
+        <w:t>四、提要求</w:t>
+      </w:r>
+    </w:p>
+    <w:p>
+      <w:r>
+        <w:t>大家想早一天解决问题，还是晚一天解决问题？大家想早一天幸福，还是晚一天幸福？最好的办法就是一定要按照标准参与。</w:t>
+      </w:r>
+    </w:p>
+    <w:p>
+      <w:pPr>
+        <w:spacing w:after="60"/>
+      </w:pPr>
+      <w:r>
+        <w:t>1.学习中间不要走开，尽量全程参与。</w:t>
+      </w:r>
+    </w:p>
+    <w:p>
+      <w:pPr>
+        <w:spacing w:after="60"/>
+      </w:pPr>
+      <w:r>
+        <w:t>2.每个人都参与进来（看别人炒菜和自己动手炒菜，谁学会的更快）。</w:t>
+      </w:r>
+    </w:p>
+    <w:p>
+      <w:pPr>
+        <w:spacing w:after="60"/>
+      </w:pPr>
+      <w:r>
+        <w:t>3.学习过程中不要接打电话。以免耽误自己学习。</w:t>
+      </w:r>
+    </w:p>
+    <w:p>
+      <w:r>
+        <w:t>五、主题</w:t>
+      </w:r>
+    </w:p>
+    <w:p>
+      <w:r>
+        <w:t>你长大了吗？什么叫长大？什么叫成熟？</w:t>
+      </w:r>
+    </w:p>
+    <w:p>
+      <w:r>
+        <w:t>共享陪听第三季智疗第41课《看不到别人的优点，你的人生就会黑暗》</w:t>
+      </w:r>
+    </w:p>
+    <w:p>
+      <w:r>
+        <w:t>六、分享听完这堂课，让你感触最深的是哪一句话或者是哪一个点？为什么？</w:t>
+      </w:r>
+    </w:p>
+    <w:p>
+      <w:r>
+        <w:t>七、采访</w:t>
+      </w:r>
+    </w:p>
+    <w:p>
+      <w:pPr>
+        <w:spacing w:after="60"/>
+      </w:pPr>
+      <w:r>
+        <w:t>1.我们大家有没有以前听到父母关心的叮嘱，也觉得烦，觉得唠叨，很不耐烦的时候，有没有甚至还没等他们的话说完，就把他们打断的时候？如果有，请你简单讲一个。</w:t>
+      </w:r>
+    </w:p>
+    <w:p>
+      <w:pPr>
+        <w:spacing w:after="60"/>
+      </w:pPr>
+      <w:r>
+        <w:t>2.回想那些场景，此时此刻，你是一种什么样的心情？</w:t>
+      </w:r>
+    </w:p>
+    <w:p>
+      <w:pPr>
+        <w:spacing w:after="60"/>
+      </w:pPr>
+      <w:r>
+        <w:t>3.这个世界上除了父母外，还有没有无条件不求回报，全身心爱我们的人？</w:t>
+      </w:r>
+    </w:p>
+    <w:p>
+      <w:pPr>
+        <w:spacing w:after="60"/>
+      </w:pPr>
+      <w:r>
+        <w:t>4.如果没有学习今天这堂课，我们能意识到我们对父母的不耐烦，没耐心，其实也是对他们的伤害吗？</w:t>
+      </w:r>
+    </w:p>
+    <w:p>
+      <w:pPr>
+        <w:spacing w:after="60"/>
+      </w:pPr>
+      <w:r>
+        <w:t>5.这个世界上除了父母的饭我们可以免费吃。剩下的每一口饭都需要自己去挣，大家认不认可？爱孩子是人的本能，但是孝敬父母才是真正的感恩。</w:t>
+      </w:r>
+    </w:p>
+    <w:p>
+      <w:pPr>
+        <w:spacing w:after="60"/>
+      </w:pPr>
+      <w:r>
+        <w:t>6.那大家愿不愿意为我们曾经的任性不懂事给父母带来的伤害，去给自己的父母做一个道歉式的点评表白呢？</w:t>
+      </w:r>
+    </w:p>
+    <w:p>
+      <w:pPr>
+        <w:spacing w:after="60"/>
+      </w:pPr>
+      <w:r>
+        <w:t>7.父母就是孩子们最好的榜样，我们用什么样的态度对待我们的父母，将来我们的孩子就会用什么样的态度来对待我们。</w:t>
+      </w:r>
+    </w:p>
+    <w:p>
+      <w:pPr>
+        <w:spacing w:after="60"/>
+      </w:pPr>
+      <w:r>
+        <w:t>8.如果将来我们也想让我们的孩子对我们孝顺，懂事，细心体贴，我们要不要给他们做好榜样？</w:t>
+      </w:r>
+    </w:p>
+    <w:p>
+      <w:r>
+        <w:t>八、闭环</w:t>
+      </w:r>
+    </w:p>
+    <w:p>
+      <w:pPr>
+        <w:spacing w:after="60"/>
+      </w:pPr>
+      <w:r>
+        <w:t>1.你有多久没有给自己的父母好好说说话了？今天跟他好好的表达一下吧。</w:t>
+      </w:r>
+    </w:p>
+    <w:p>
+      <w:pPr>
+        <w:spacing w:after="60"/>
+      </w:pPr>
+      <w:r>
+        <w:t>2.今天的学习内容好不好？像这样的学习内容，后面你还愿不愿意继续再学？</w:t>
+      </w:r>
+    </w:p>
+    <w:p>
+      <w:pPr>
+        <w:spacing w:after="60"/>
+      </w:pPr>
+      <w:r>
+        <w:t>3.成就不是学历决定，而是由经历决定！</w:t>
+      </w:r>
+    </w:p>
+    <w:p>
+      <w:r>
+        <w:t>学习结束留作业</w:t>
+      </w:r>
+    </w:p>
+    <w:p>
+      <w:r>
+        <w:t>每个人给自己的父母发一个点评问候信息或者打个点评问候电话，如果父母已经不在就给自己的亲人或其他家人说一段点评式的心里话，不限时长，不限字数多少，只要是真心点评的就可以，完成后及时在群里反馈结果，对方收到你的信息或者电话是一种什么样的反应？如果效果不理想及时找到群主复盘找到原因并帮助解决。</w:t>
+      </w:r>
+    </w:p>
+    <w:p>
+      <w:r>
+        <w:t>收作业</w:t>
+      </w:r>
+    </w:p>
+    <w:p>
+      <w:r>
+        <w:t>群主记得收作业，不按时完成作业，学习态度不端正的，默认不需要幸福，不重视家庭，对家庭不负责任，抱出群取消学习机会。</w:t>
+      </w:r>
+    </w:p>
+    <w:p>
+      <w:r>
+        <w:t>受益顾客交作业的标准：</w:t>
+      </w:r>
+    </w:p>
+    <w:p>
+      <w:r>
+        <w:t>今天你给哪一个家人表达了，在什么场景下用的？你当时说了一段什么样的话，你的家人给了你什么样的一个反应或者反馈？</w:t>
+      </w:r>
+    </w:p>
+    <w:p>
+      <w:r>
+        <w:t>正式训练第6天</w:t>
+      </w:r>
+    </w:p>
+    <w:p>
+      <w:r>
+        <w:t>共享《老男人超哥》视频</w:t>
+      </w:r>
+    </w:p>
+    <w:p>
+      <w:r>
+        <w:t>一、破冰</w:t>
+      </w:r>
+    </w:p>
+    <w:p>
+      <w:r>
+        <w:t>现在很多人家庭不和睦，不是吵架就是冷战，一个月不说话，甚至更久，想要离婚的比比皆是。</w:t>
+      </w:r>
+    </w:p>
+    <w:p>
+      <w:r>
+        <w:t>但有的家庭温馨和睦，笑声不断，事业也顺风顺水。这到底是哪里的问题呢？</w:t>
+      </w:r>
+    </w:p>
+    <w:p>
+      <w:r>
+        <w:t>别着急，明天早上9点，腾讯会议为你揭秘！</w:t>
+      </w:r>
+    </w:p>
+    <w:p>
+      <w:r>
+        <w:t>二、榜样采访</w:t>
+      </w:r>
+    </w:p>
+    <w:p>
+      <w:r>
+        <w:t>采访头一天的榜样，有突破的就让她来做两三分钟的分享（避免话停不下来的人，提前给她简单梳理一下，按照下面发问，三分钟左右精准分享）</w:t>
+      </w:r>
+    </w:p>
+    <w:p>
+      <w:pPr>
+        <w:spacing w:after="60"/>
+      </w:pPr>
+      <w:r>
         <w:t>1.简单破冰引出榜样邀请这个人出来分享前，根据她的突破结果，简单精准一句话做个破冰，然后再邀请她出来分享</w:t>
       </w:r>
     </w:p>
@@ -5100,27 +6536,12 @@
         <w:spacing w:after="60"/>
       </w:pPr>
       <w:r>
-        <w:t>3.分享完，主持人简单总结两句，引出发心语言我们又帮到了一个家庭，又少了一个被家庭内耗伤害的人，感受到了开幸福训练营的意义，更有动力继续开下去</w:t>
-      </w:r>
-    </w:p>
-    <w:p>
-      <w:r>
-        <w:t>例：只是说对了一句话，家里的氛围却变了</w:t>
-      </w:r>
-    </w:p>
-    <w:p>
-      <w:r>
-        <w:t>例：只是给老公说了一句话，成天冷冰冰的老公却笑了等等</w:t>
-      </w:r>
-    </w:p>
-    <w:p>
-      <w:r>
-        <w:t>操作提示：</w:t>
-      </w:r>
-    </w:p>
-    <w:p>
-      <w:r>
-        <w:t>主持人能量语言贯穿始终，随时随地注意点评所有参与者。</w:t>
+        <w:t>3.分享完主持人简单总结两句，引出发心语言我们又帮到了一个家庭，又少了一个被家庭内耗伤害的人，感受到了开幸福训练营的意义，更有动力继续开下去例：只是说对了一句话，家里的氛围却变了例：只是给老公说了一句话，成天冷冰冰的老公却笑了等等</w:t>
+      </w:r>
+    </w:p>
+    <w:p>
+      <w:r>
+        <w:t>操作提示：主持人能量语言贯穿始终，随时随地注意点评所有参与者。</w:t>
       </w:r>
     </w:p>
     <w:p>
@@ -5135,12 +6556,7 @@
     </w:p>
     <w:p>
       <w:r>
-        <w:t>要点：开心八式</w:t>
-      </w:r>
-    </w:p>
-    <w:p>
-      <w:r>
-        <w:t>眼睛微闭，用心的拍，开心的拍，越拍越痛，越痛越通，越通越轻松。</w:t>
+        <w:t>要点：开心八式眼睛微闭，用心的拍，开心的拍，越拍越痛，越痛越通，越通越轻松。</w:t>
       </w:r>
     </w:p>
     <w:p>
@@ -5186,91 +6602,25 @@
         <w:spacing w:after="60"/>
       </w:pPr>
       <w:r>
-        <w:t>2.每个人都参与进来（看别人炒菜和自己动手炒菜，谁学会的更快）</w:t>
-      </w:r>
-    </w:p>
-    <w:p>
-      <w:pPr>
-        <w:spacing w:after="60"/>
-      </w:pPr>
-      <w:r>
-        <w:t>3.学习过程中不要接打电话，以免耽误自己学习。</w:t>
-      </w:r>
-    </w:p>
-    <w:p>
-      <w:r>
-        <w:t>五、主题主题：高情商说话方式（重点：让学习者人人参与进来）</w:t>
-      </w:r>
-    </w:p>
-    <w:p>
-      <w:pPr>
-        <w:spacing w:after="60"/>
-      </w:pPr>
-      <w:r>
-        <w:t>1.互动游戏：虽然+但是（重点，让学习者人人参与进来）</w:t>
-      </w:r>
-    </w:p>
-    <w:p>
-      <w:r>
-        <w:t>找出一个朋友（发小，闺蜜，同学）</w:t>
-      </w:r>
-    </w:p>
-    <w:p>
-      <w:pPr>
-        <w:spacing w:after="60"/>
-      </w:pPr>
-      <w:r>
-        <w:t>2.分别找到一个优点，再找到他的一个缺点，写出来，然后在会议室两人结对相互演练表达</w:t>
-      </w:r>
-    </w:p>
-    <w:p>
-      <w:r>
-        <w:t>①先用“虽然+优点，但是+缺点”的方式表达一遍</w:t>
-      </w:r>
-    </w:p>
-    <w:p>
-      <w:r>
-        <w:t>每个人感觉一下是一种什么样的感受？</w:t>
-      </w:r>
-    </w:p>
-    <w:p>
-      <w:r>
-        <w:t>每个人简单说一下自己听完之后什么样的感觉？</w:t>
-      </w:r>
-    </w:p>
-    <w:p>
-      <w:r>
-        <w:t>②接下来再用“虽然+缺点，但是+优点”的方式再表达一遍</w:t>
-      </w:r>
-    </w:p>
-    <w:p>
-      <w:r>
-        <w:t>每个人感觉一下是一种什么样的感受？</w:t>
-      </w:r>
-    </w:p>
-    <w:p>
-      <w:r>
-        <w:t>每个人简单说一下自己听完之后什么样的感觉？</w:t>
-      </w:r>
-    </w:p>
-    <w:p>
-      <w:r>
-        <w:t>听到这种表达方式，有一种什么样的感觉？</w:t>
-      </w:r>
-    </w:p>
-    <w:p>
-      <w:r>
-        <w:t>六、分享</w:t>
-      </w:r>
-    </w:p>
-    <w:p>
-      <w:r>
-        <w:t>大家更喜哪一种表达方式表达出来的感觉？</w:t>
-      </w:r>
-    </w:p>
-    <w:p>
-      <w:r>
-        <w:t>为什么？（鸡屁股生什么？鸡屎还是鸡蛋？）</w:t>
+        <w:t>2.每个人都参与进来（看别人炒菜和自己动手炒菜，谁学会的更快）。</w:t>
+      </w:r>
+    </w:p>
+    <w:p>
+      <w:pPr>
+        <w:spacing w:after="60"/>
+      </w:pPr>
+      <w:r>
+        <w:t>3.学习过程中不要接打电话。以免耽误自己学习。</w:t>
+      </w:r>
+    </w:p>
+    <w:p>
+      <w:r>
+        <w:t>五、主题共享《老男人超哥》视频</w:t>
+      </w:r>
+    </w:p>
+    <w:p>
+      <w:r>
+        <w:t>六、分享看完这个视频，让你感受最深的是哪个点？每个人简单分享一下</w:t>
       </w:r>
     </w:p>
     <w:p>
@@ -5279,28 +6629,115 @@
       </w:r>
     </w:p>
     <w:p>
-      <w:r>
-        <w:t>①以前你跟你的同学，朋友都是用什么样的表达方式？以前的那种表达方式跟今天学习的这种表达方式，你觉得哪一种更能增加你们之间的感情？哪一种让你觉得人跟人之间更温暖？</w:t>
-      </w:r>
-    </w:p>
-    <w:p>
-      <w:r>
-        <w:t>从小到大有没有因为你的心直口快，不小心说了重话伤到朋友的场景，如果有请你说一个。</w:t>
-      </w:r>
-    </w:p>
-    <w:p>
-      <w:r>
-        <w:t>②如果我们到现在也没有学会今天这种表达方式，一直都是随心所欲，随意任性表达，有没有发现现在人跟人之间的感情越来越淡薄？</w:t>
-      </w:r>
-    </w:p>
-    <w:p>
-      <w:r>
-        <w:t>真心的朋友好像越来越少，人心跟人心之间的距离越来越远，这样淡漠的生活环境，是我们大家想要的吗？</w:t>
-      </w:r>
-    </w:p>
-    <w:p>
-      <w:r>
-        <w:t>③如果我们想要跟朋友发小之间的关系越来越亲近，人跟人之间越来越有温度的相处，正确的做法我们应该怎么做呢？（答案让对方说出来）</w:t>
+      <w:pPr>
+        <w:spacing w:after="60"/>
+      </w:pPr>
+      <w:r>
+        <w:t>1.选择题家庭幸福，事业成功，有很多朋友，有很多钱、车、房。如果只能选一样，你会选哪一个？说说你的选择理由。孩子，父母，爱人，兄弟姐妹，发小，朋友，同学。如果只选择一个，你会选哪一个？说说你的选择理由。</w:t>
+      </w:r>
+    </w:p>
+    <w:p>
+      <w:pPr>
+        <w:spacing w:after="60"/>
+      </w:pPr>
+      <w:r>
+        <w:t>2.视频里面的这对夫妻，看着是不是也是普通的家庭？但是他们的幸福感是不是非常的强烈？</w:t>
+      </w:r>
+    </w:p>
+    <w:p>
+      <w:pPr>
+        <w:spacing w:after="60"/>
+      </w:pPr>
+      <w:r>
+        <w:t>3.他们的幸福感是钱和容貌带给他们的，还是他们相互给到对方的满满的情绪价值给的？</w:t>
+      </w:r>
+    </w:p>
+    <w:p>
+      <w:pPr>
+        <w:spacing w:after="60"/>
+      </w:pPr>
+      <w:r>
+        <w:t>4.他们的嘴巴里说出来都是好帅，好看，好香，好吃，好棒</w:t>
+      </w:r>
+    </w:p>
+    <w:p>
+      <w:pPr>
+        <w:spacing w:after="60"/>
+      </w:pPr>
+      <w:r>
+        <w:t>5.如果是你们给家人做了一顿饭，听到的都是这样的，称赞的，肯定的词语，你是一种什么样的心情？是不是再累心里都开心，是不是下次还愿意继续做？</w:t>
+      </w:r>
+    </w:p>
+    <w:p>
+      <w:pPr>
+        <w:spacing w:after="60"/>
+      </w:pPr>
+      <w:r>
+        <w:t>6.其实大家愿不愿意承认，我们遇见的另一半，不管他是什么样的，他都是跟我们当下最匹配的，所以我们才会遇见。所以那些抱怨另一半的人都是傻子</w:t>
+      </w:r>
+    </w:p>
+    <w:p>
+      <w:pPr>
+        <w:spacing w:after="60"/>
+      </w:pPr>
+      <w:r>
+        <w:t>7.婚姻的本质是输赢还是幸福？</w:t>
+      </w:r>
+    </w:p>
+    <w:p>
+      <w:pPr>
+        <w:spacing w:after="60"/>
+      </w:pPr>
+      <w:r>
+        <w:t>8.好多人在日常生活当中出现一点小矛盾，就拼命的争吵，他们是不是都想赢？</w:t>
+      </w:r>
+    </w:p>
+    <w:p>
+      <w:pPr>
+        <w:spacing w:after="60"/>
+      </w:pPr>
+      <w:r>
+        <w:t>9.可是最后吵赢了的人，他赢了什么？表面看赢了一句话，却输掉了夫妻感情这到底是赢了还是输了？吵架吵赢了他得到了幸福感吗？</w:t>
+      </w:r>
+    </w:p>
+    <w:p>
+      <w:pPr>
+        <w:spacing w:after="60"/>
+      </w:pPr>
+      <w:r>
+        <w:t>10.没有学习过的家庭，随便一点点鸡毛蒜皮，是不是就容易争吵，抬杠？长期相互埋怨，家里每天都是鸡飞狗跳的，让自己也感觉身心疲惫</w:t>
+      </w:r>
+    </w:p>
+    <w:p>
+      <w:pPr>
+        <w:spacing w:after="60"/>
+      </w:pPr>
+      <w:r>
+        <w:t>11.长期争吵，抬杠，抱怨的家庭你认为会不会影响到孩子们的心情状态？</w:t>
+      </w:r>
+    </w:p>
+    <w:p>
+      <w:pPr>
+        <w:spacing w:after="60"/>
+      </w:pPr>
+      <w:r>
+        <w:t>12.时间久了，孩子们的学习是不是也会受影响？孩子们会不会变得自卑，木讷，性格受影响？父母经常爱抬杠，爱吵架的家庭，大家会发现孩子的性格都变得越来越暴躁，或者抑郁封闭自己，跟父母之间距离越来越远。</w:t>
+      </w:r>
+    </w:p>
+    <w:p>
+      <w:pPr>
+        <w:spacing w:after="60"/>
+      </w:pPr>
+      <w:r>
+        <w:t>13.请问这样的结果是大家想要的吗？</w:t>
+      </w:r>
+    </w:p>
+    <w:p>
+      <w:pPr>
+        <w:spacing w:after="60"/>
+      </w:pPr>
+      <w:r>
+        <w:t>14.如果不想要正确的做法，我们应该怎么做呢？</w:t>
       </w:r>
     </w:p>
     <w:p>
@@ -5309,29 +6746,18 @@
       </w:r>
     </w:p>
     <w:p>
-      <w:pPr>
-        <w:spacing w:after="60"/>
-      </w:pPr>
-      <w:r>
-        <w:t>1.闭环到正确的做法</w:t>
-      </w:r>
-    </w:p>
-    <w:p>
-      <w:r>
-        <w:t>要不要持续坚持用这种看优点的视角和表达方式，跟我们身边的人好好交流。</w:t>
-      </w:r>
-    </w:p>
-    <w:p>
-      <w:pPr>
-        <w:spacing w:after="60"/>
-      </w:pPr>
-      <w:r>
-        <w:t>2.闭环到持续学习</w:t>
-      </w:r>
-    </w:p>
-    <w:p>
-      <w:r>
-        <w:t>我们以后要不要持续学习，让自己成为一个高情商的人，成为一个会发现幸福，创造幸福的人。</w:t>
+      <w:r>
+        <w:t>①多看对方的付出，并及时给予肯定，不吝啬赞美我们每个人都是普通人，都有很多缺点，所以不要用完美的要求去要求我们的另一半。</w:t>
+      </w:r>
+    </w:p>
+    <w:p>
+      <w:r>
+        <w:t>②人生的在不同阶段会遇见不同的问题如果不学习，没有拥有解决问题的思维，是不是永远都是一地鸡毛？</w:t>
+      </w:r>
+    </w:p>
+    <w:p>
+      <w:r>
+        <w:t>③所以我们要不要持续不断的学习？让我们成为一个解决问题的高手，从容面对生活当中的各种各样的现象，能力强了，问题也就少了。</w:t>
       </w:r>
     </w:p>
     <w:p>
@@ -5341,7 +6767,7 @@
     </w:p>
     <w:p>
       <w:r>
-        <w:t>用今天学到的方式至少给一到两个朋友进行实践，实践完及时在群里反馈结果，如果效果不理想,及时找到群主复盘找到原因并帮助解决，持续为做一个幸福的人而坚持。</w:t>
+        <w:t>继续给家人点评，哪怕是他说的一句话，或者他做的一顿饭，做的一件事。及时的给予肯定表达，点评完对方是什么样的反应，及时来群里分享反馈。让我们所有的人都来感受你们的幸福吧</w:t>
       </w:r>
     </w:p>
     <w:p>
@@ -5351,7 +6777,7 @@
     </w:p>
     <w:p>
       <w:r>
-        <w:t>群主记得收作业，不按时完成作业，学习态度不端正的，默认不需要幸福，不重视家庭，对家庭不负责任,抱出群取消学习机会。</w:t>
+        <w:t>群主记得收作业，不按时完成作业，学习态度不端正的，默认不需要幸福，不重视家庭，对家庭不负责任，抱出群取消学习机会。</w:t>
       </w:r>
     </w:p>
     <w:p>
@@ -5366,17 +6792,12 @@
     </w:p>
     <w:p>
       <w:r>
-        <w:t>正式训练第3天</w:t>
-      </w:r>
-    </w:p>
-    <w:p>
-      <w:r>
-        <w:t>互动游戏（找优点-辛苦和不容易）</w:t>
-      </w:r>
-    </w:p>
-    <w:p>
-      <w:r>
-        <w:t>（重点：让学习者人人参与进来）</w:t>
+        <w:t>正式训练第7天</w:t>
+      </w:r>
+    </w:p>
+    <w:p>
+      <w:r>
+        <w:t>共享视频《你的烦恼或许正是你的幸福》</w:t>
       </w:r>
     </w:p>
     <w:p>
@@ -5386,22 +6807,22 @@
     </w:p>
     <w:p>
       <w:r>
-        <w:t>一个大姐，买菜、做饭、打扫卫生，却得不到老公一句认可，心里委屈痛苦不堪，差点走到婚姻的边缘。</w:t>
-      </w:r>
-    </w:p>
-    <w:p>
-      <w:r>
-        <w:t>没想到做对了一个动作，老公买菜做饭，还抢着干活，现在夫妻俩回到了谈恋爱的感觉，家里欢声笑语不断。</w:t>
-      </w:r>
-    </w:p>
-    <w:p>
-      <w:r>
-        <w:t>到底什么动作有这么大的魅力？就像变魔术一样。</w:t>
-      </w:r>
-    </w:p>
-    <w:p>
-      <w:r>
-        <w:t>想知道的家人，明天的幸福训练营第三天，不见不散！</w:t>
+        <w:t>你有没有经常为孩子写作业拖拉，沉迷游戏，动不动就责骂惩罚孩子叛逆说不了几句就抬杠，内心焦虑又无可奈何！</w:t>
+      </w:r>
+    </w:p>
+    <w:p>
+      <w:r>
+        <w:t>别着急，一个视频就会让你摆脱这些烦恼，孩子主动减少玩游戏的时间，跟父母聊天，家里笑声不断。</w:t>
+      </w:r>
+    </w:p>
+    <w:p>
+      <w:r>
+        <w:t>到底是什么视频这么神奇呢？</w:t>
+      </w:r>
+    </w:p>
+    <w:p>
+      <w:r>
+        <w:t>想知道的家人，明天腾讯会议为你揭秘！</w:t>
       </w:r>
     </w:p>
     <w:p>
@@ -5419,7 +6840,7 @@
         <w:spacing w:after="60"/>
       </w:pPr>
       <w:r>
-        <w:t>1.简单破冰引出榜样邀请这个人出来分享前，根据她的突破结果，简单精准一句话做个破冰，然后再邀请她出来分享</w:t>
+        <w:t>1.简单破冰引出榜样邀请这个人出来分享前，根据她的突破结果，简单精准一句话做个破冰，然后再邀请她出来分享。</w:t>
       </w:r>
     </w:p>
     <w:p>
@@ -5450,27 +6871,12 @@
         <w:spacing w:after="60"/>
       </w:pPr>
       <w:r>
-        <w:t>3.分享完主持人简单总结两句，引出发心语言我们又帮到了一个家庭，又少了一个被家庭内耗伤害的人。感受到了开幸福训练营的意义，更有动力继续开下去</w:t>
-      </w:r>
-    </w:p>
-    <w:p>
-      <w:r>
-        <w:t>例：只是说对了一句话，家里的氛围却变了</w:t>
-      </w:r>
-    </w:p>
-    <w:p>
-      <w:r>
-        <w:t>例：只是给老公说了一句话，成天冷冰冰的老公却笑了等等</w:t>
-      </w:r>
-    </w:p>
-    <w:p>
-      <w:r>
-        <w:t>操作提示：</w:t>
-      </w:r>
-    </w:p>
-    <w:p>
-      <w:r>
-        <w:t>主持人能量语言贯穿始终，随时随地注意点评所有参与者。</w:t>
+        <w:t>3、分享完主持人简单总结两句，引出发心语言我们又帮到了一个家庭，又少了一个被家庭内耗伤害的人，感受到了开幸福训练营的意义，更有动力继续开下去例：只是说对了一句话，家里的氛围却变了例：只是给老公说了一句话，成天冷冰冰的老公却笑了等等</w:t>
+      </w:r>
+    </w:p>
+    <w:p>
+      <w:r>
+        <w:t>操作提示：主持人能量语言贯穿始终，随时随地注意点评所有参与者</w:t>
       </w:r>
     </w:p>
     <w:p>
@@ -5485,12 +6891,7 @@
     </w:p>
     <w:p>
       <w:r>
-        <w:t>要点：开心八式</w:t>
-      </w:r>
-    </w:p>
-    <w:p>
-      <w:r>
-        <w:t>眼睛微闭，用心的拍，开心的拍，越拍越痛，越痛越通，越通越轻松。</w:t>
+        <w:t>要点：开心八式眼睛微闭，用心的拍，开心的拍，越拍越痛，越痛越通，越通越轻松。</w:t>
       </w:r>
     </w:p>
     <w:p>
@@ -5549,54 +6950,12 @@
     </w:p>
     <w:p>
       <w:r>
-        <w:t>五、主题</w:t>
-      </w:r>
-    </w:p>
-    <w:p>
-      <w:pPr>
-        <w:spacing w:after="60"/>
-      </w:pPr>
-      <w:r>
-        <w:t>1.游戏规则：找一个家人（爱人，父母，孩子，婆婆，媳妇儿）</w:t>
-      </w:r>
-    </w:p>
-    <w:p>
-      <w:pPr>
-        <w:spacing w:after="60"/>
-      </w:pPr>
-      <w:r>
-        <w:t>2.找到他（她）的1-2个优点写出来（提前准备好优点清单）</w:t>
-      </w:r>
-    </w:p>
-    <w:p>
-      <w:pPr>
-        <w:spacing w:after="60"/>
-      </w:pPr>
-      <w:r>
-        <w:t>3.再用一个具体场景来描述呈现它的这个优点，简单写出来</w:t>
-      </w:r>
-    </w:p>
-    <w:p>
-      <w:r>
-        <w:t>【重点是写出对方的辛苦和不容易，因为看见别人的辛苦和不容易会幸福，看见自己的辛苦和不容易会痛苦】</w:t>
-      </w:r>
-    </w:p>
-    <w:p>
-      <w:pPr>
-        <w:spacing w:after="60"/>
-      </w:pPr>
-      <w:r>
-        <w:t>4.写完后，会议室结对子，两两互练（假设自己要表达的那个人就在眼前），用第一人称现场模拟演示自己的优点加场景。</w:t>
-      </w:r>
-    </w:p>
-    <w:p>
-      <w:r>
-        <w:t>六、分享</w:t>
-      </w:r>
-    </w:p>
-    <w:p>
-      <w:r>
-        <w:t>每个人再简单分享一下今天的对练,有一种什么样的感受？</w:t>
+        <w:t>五、主题共享视频《你的烦恼或许正是你的幸福》</w:t>
+      </w:r>
+    </w:p>
+    <w:p>
+      <w:r>
+        <w:t>六、分享看完视频，听着视频里这个爸爸的描述，里面让你触动最深的是哪一个点，这个点为什么触动了你？简单分享一下。</w:t>
       </w:r>
     </w:p>
     <w:p>
@@ -5605,38 +6964,131 @@
       </w:r>
     </w:p>
     <w:p>
-      <w:r>
-        <w:t>互动讨论</w:t>
-      </w:r>
-    </w:p>
-    <w:p>
-      <w:r>
-        <w:t>①没有学习前你平常用哪一种方式给家人表达的最多，是看到优点说出来，还是看到缺点说出来？</w:t>
-      </w:r>
-    </w:p>
-    <w:p>
-      <w:r>
-        <w:t>获得了一个什么样的结果？</w:t>
-      </w:r>
-    </w:p>
-    <w:p>
-      <w:r>
-        <w:t>②当时发生了什么事（简单讲一个自己的案例）</w:t>
-      </w:r>
-    </w:p>
-    <w:p>
-      <w:r>
-        <w:t>③出现问题后都怎么解决了，解决效果怎么样</w:t>
-      </w:r>
-    </w:p>
-    <w:p>
-      <w:r>
-        <w:t>④如果到现在还没有参加过这样的学习，错误的方式持续下去会出现什么样的后果？这样的结果是你想要的吗？</w:t>
-      </w:r>
-    </w:p>
-    <w:p>
-      <w:r>
-        <w:t>⑤如果不想要正确的做法，我们应该怎么做呢？（引导对方说出来、在闭环里）</w:t>
+      <w:pPr>
+        <w:spacing w:after="60"/>
+      </w:pPr>
+      <w:r>
+        <w:t>1.你平常有没有因为孩子写作业拖拉，上学磨蹭，辅导他写作业他总也不会，或者是因为老师的一个投诉电话打骂过孩子？</w:t>
+      </w:r>
+    </w:p>
+    <w:p>
+      <w:pPr>
+        <w:spacing w:after="60"/>
+      </w:pPr>
+      <w:r>
+        <w:t>2.有没有对孩子狠狠的说过你现在都觉得挺过分的话？</w:t>
+      </w:r>
+    </w:p>
+    <w:p>
+      <w:pPr>
+        <w:spacing w:after="60"/>
+      </w:pPr>
+      <w:r>
+        <w:t>3.有没有因为他考试的分少责骂他？</w:t>
+      </w:r>
+    </w:p>
+    <w:p>
+      <w:pPr>
+        <w:spacing w:after="60"/>
+      </w:pPr>
+      <w:r>
+        <w:t>4.有没有拿他跟别人家的孩子比？</w:t>
+      </w:r>
+    </w:p>
+    <w:p>
+      <w:pPr>
+        <w:spacing w:after="60"/>
+      </w:pPr>
+      <w:r>
+        <w:t>5.从小到大，因为他做了一件什么样的错事，被你狠狠的责骂或者惩罚？请你简单分享一个场景。</w:t>
+      </w:r>
+    </w:p>
+    <w:p>
+      <w:pPr>
+        <w:spacing w:after="60"/>
+      </w:pPr>
+      <w:r>
+        <w:t>6.当孩子们遇见各种各样问题的时候，你觉得他是故意把事情做坏的，还是他其实也很想做好，但是力不从心。</w:t>
+      </w:r>
+    </w:p>
+    <w:p>
+      <w:pPr>
+        <w:spacing w:after="60"/>
+      </w:pPr>
+      <w:r>
+        <w:t>7.如果我们把拖拉，磨蹭，考试等等这些问题当做是敌人，那么当敌人出现的时候，我们是应该跟孩子站在一起把敌人打败，还是应该跟敌人站在一起把孩子打败呢？</w:t>
+      </w:r>
+    </w:p>
+    <w:p>
+      <w:pPr>
+        <w:spacing w:after="60"/>
+      </w:pPr>
+      <w:r>
+        <w:t>8.那我们是怎么做的呢？做对了还是做错了？</w:t>
+      </w:r>
+    </w:p>
+    <w:p>
+      <w:pPr>
+        <w:spacing w:after="60"/>
+      </w:pPr>
+      <w:r>
+        <w:t>9.问题发生后，我们不断的指责，抱怨，甚至打骂孩子，对解决问题有没有任何的帮助？</w:t>
+      </w:r>
+    </w:p>
+    <w:p>
+      <w:pPr>
+        <w:spacing w:after="60"/>
+      </w:pPr>
+      <w:r>
+        <w:t>10.我们没有帮助孩子去打败问题，却跟问题站在一起指责抱怨孩子的时候，孩子心里会不会有压力，压抑，委屈，小的时候他不会反抗，你会发现他的胆子越来越小，受了委屈就爱哭，越来越不自信，越来越内向，有没有这种情况？</w:t>
+      </w:r>
+    </w:p>
+    <w:p>
+      <w:pPr>
+        <w:spacing w:after="60"/>
+      </w:pPr>
+      <w:r>
+        <w:t>11.随着时间的推移，孩子心里压的东西越来越多，孩子的性格会不会越来越急躁，暴躁，在你面前越来越没有耐心，动不动就跟你对抗，也就是所谓的叛逆期来了，所以叛逆是怎么来的大家明白了吗？</w:t>
+      </w:r>
+    </w:p>
+    <w:p>
+      <w:pPr>
+        <w:spacing w:after="60"/>
+      </w:pPr>
+      <w:r>
+        <w:t>12.有的孩子跟父母甚至一说话就吵，让父母也是焦虑万分却无可奈何，有没有这种情况发生？</w:t>
+      </w:r>
+    </w:p>
+    <w:p>
+      <w:pPr>
+        <w:spacing w:after="60"/>
+      </w:pPr>
+      <w:r>
+        <w:t>13.这些结果都是我们想要的吗？</w:t>
+      </w:r>
+    </w:p>
+    <w:p>
+      <w:pPr>
+        <w:spacing w:after="60"/>
+      </w:pPr>
+      <w:r>
+        <w:t>14.如果这些都不是我们想要的，那正确的做法我们应该怎么做呢？</w:t>
+      </w:r>
+    </w:p>
+    <w:p>
+      <w:pPr>
+        <w:spacing w:after="60"/>
+      </w:pPr>
+      <w:r>
+        <w:t>15.珍惜跟孩子们在一起的时光，孩子在身边，好好说话，有问题共同解决。</w:t>
+      </w:r>
+    </w:p>
+    <w:p>
+      <w:pPr>
+        <w:spacing w:after="60"/>
+      </w:pPr>
+      <w:r>
+        <w:t>16.多沟通多换位思考，不挑毛病指责，多相互体谅对方的不容易。（孩子们也有他们的不容易。）</w:t>
       </w:r>
     </w:p>
     <w:p>
@@ -5649,30 +7101,23 @@
         <w:spacing w:after="60"/>
       </w:pPr>
       <w:r>
-        <w:t>1.闭环到正确的做法</w:t>
-      </w:r>
-    </w:p>
-    <w:p>
-      <w:r>
-        <w:t>①看正面放负面，多看优点并表达出来</w:t>
-      </w:r>
-    </w:p>
-    <w:p>
-      <w:r>
-        <w:t>②允许每个人有缺点存在，因为我们自己也有很多缺点。</w:t>
-      </w:r>
-    </w:p>
-    <w:p>
-      <w:pPr>
-        <w:spacing w:after="60"/>
-      </w:pPr>
-      <w:r>
-        <w:t>2.闭环到持续学习</w:t>
-      </w:r>
-    </w:p>
-    <w:p>
-      <w:r>
-        <w:t>幸福是一阵子的事儿，还是一辈子的事儿？所以坚持持续学习，有没有必要？</w:t>
+        <w:t>1.一天的学习能不能解决一辈子的问题？（肯定不能）那7天的学习能不能管一辈子？所以我们只有持续的学习，才不会让我们的生活过得一地鸡毛，对不对？</w:t>
+      </w:r>
+    </w:p>
+    <w:p>
+      <w:pPr>
+        <w:spacing w:after="60"/>
+      </w:pPr>
+      <w:r>
+        <w:t>2.类似这样的学习，后面我们还有很多，每一次学习都能解决我们生活当中的一个问题，当你持续不断的参加完我们的学习之后，你就会成为生活当中解决所有问题的高手，没有任何问题可以困住你。 所以下次如果还有类似的学习，你还愿不愿意再参加了？</w:t>
+      </w:r>
+    </w:p>
+    <w:p>
+      <w:pPr>
+        <w:spacing w:after="60"/>
+      </w:pPr>
+      <w:r>
+        <w:t>3.如果还要学习的话，提前报名，因为我们为了保证学习质量，每一次都有名额限制，提前告诉我这边给您备注，到时候开营学习的时候，我提前邀请您。如果要带朋友进群，也要提前报备，一个人只能带一个朋友，提前告诉我，我给您预留名额。</w:t>
       </w:r>
     </w:p>
     <w:p>
@@ -5682,7 +7127,7 @@
     </w:p>
     <w:p>
       <w:r>
-        <w:t>用今天学到的方式至少给一到两个家人进行实践点评，最好是先给自己的爱人实践，然后才是孩子及其他家人，实践完及时在群里反馈结果，如果效果不理想及时找到群主复盘找到原因并帮助解决，坚决不能让不好的因素继续影响家庭幸福。</w:t>
+        <w:t>学习结束后，如果孩子在家的，抽空陪着孩子共同观看这个视频，并真诚的跟孩子聊，看完这个视频之后自己内心真实的感受，趁这个机会跟孩子说说很多的心里话。 如果孩子没有在身边，给孩子写个点评，说说你今天去孩子的房间了，看到空落落的房间，想到了孩子过往的某一个场景，某一件事。再来个表白吧。 点评完对方是什么样的反应，及时来群里分享反馈，让我们所有的人都来感受你们的幸福吧！</w:t>
       </w:r>
     </w:p>
     <w:p>
@@ -5697,11 +7142,6 @@
     </w:p>
     <w:p>
       <w:r>
-        <w:t>给予深度点评和梳理，给方向给希望，做深度陪伴，点评出有价值的有意义的（大春老师点评抽离出规律才显示出来分享的价值），点评他的成长，他的行为背后的意义。</w:t>
-      </w:r>
-    </w:p>
-    <w:p>
-      <w:r>
         <w:t>受益顾客交作业的标准：</w:t>
       </w:r>
     </w:p>
@@ -5712,1140 +7152,6 @@
     </w:p>
     <w:p>
       <w:r>
-        <w:t>正式训练第4天</w:t>
-      </w:r>
-    </w:p>
-    <w:p>
-      <w:r>
-        <w:t>互动游戏找优点-辛苦和不容易（提前准备好优点清单）</w:t>
-      </w:r>
-    </w:p>
-    <w:p>
-      <w:r>
-        <w:t>（每一个参加学习的人都要参加进来）</w:t>
-      </w:r>
-    </w:p>
-    <w:p>
-      <w:r>
-        <w:t>一、破冰</w:t>
-      </w:r>
-    </w:p>
-    <w:p>
-      <w:r>
-        <w:t>一个小姐姐，平时对人很好，也喜欢帮忙，可就是不招人喜欢，很是郁闷。</w:t>
-      </w:r>
-    </w:p>
-    <w:p>
-      <w:r>
-        <w:t>没想到做对了一个动作，身边人都喜欢和她在一起，现在成了人人都喜欢的蜜姐。</w:t>
-      </w:r>
-    </w:p>
-    <w:p>
-      <w:r>
-        <w:t>想知道他做对了什么动作，这么大的魅力吗？</w:t>
-      </w:r>
-    </w:p>
-    <w:p>
-      <w:r>
-        <w:t>想知道的家人，明天腾讯会议不见不散！</w:t>
-      </w:r>
-    </w:p>
-    <w:p>
-      <w:r>
-        <w:t>二、榜样采访</w:t>
-      </w:r>
-    </w:p>
-    <w:p>
-      <w:r>
-        <w:t>采访头一天的榜样有突破的就让她来做两三分钟的分享（避免话停不下来的人，提前给她简单梳理一下，按照下面发问，三分钟左右精准分享）</w:t>
-      </w:r>
-    </w:p>
-    <w:p>
-      <w:pPr>
-        <w:spacing w:after="60"/>
-      </w:pPr>
-      <w:r>
-        <w:t>1.简单破冰引出榜样邀请这个人出来分享前，根据她的突破结果，简单精准一句话做个破冰，然后再邀请她出来分享</w:t>
-      </w:r>
-    </w:p>
-    <w:p>
-      <w:pPr>
-        <w:spacing w:after="60"/>
-      </w:pPr>
-      <w:r>
-        <w:t>2.分享标准发问</w:t>
-      </w:r>
-    </w:p>
-    <w:p>
-      <w:r>
-        <w:t>①昨天学习后给家里哪个人表达了？当时是什么样的场景，家人给了一个什么样的反馈？自己有什么样的感触？</w:t>
-      </w:r>
-    </w:p>
-    <w:p>
-      <w:r>
-        <w:t>②遇见同样的问题，困扰多久了，以前是怎么解决的？得到了个什么结果？</w:t>
-      </w:r>
-    </w:p>
-    <w:p>
-      <w:r>
-        <w:t>③这样的学习效果，学习方式你是否满意？是否喜欢？</w:t>
-      </w:r>
-    </w:p>
-    <w:p>
-      <w:pPr>
-        <w:spacing w:after="60"/>
-      </w:pPr>
-      <w:r>
-        <w:t>3.分享完主持人简单总结两句，引出发心语言我们又帮到了一个家庭，又少了一个被家庭内耗伤害的人。感受到了开幸福训练营的意义，更有动力继续开下去</w:t>
-      </w:r>
-    </w:p>
-    <w:p>
-      <w:r>
-        <w:t>例：只是说对了一句话，家里的氛围却变了</w:t>
-      </w:r>
-    </w:p>
-    <w:p>
-      <w:r>
-        <w:t>例：只是给老公说了一句话，成天冷冰冰的老公却笑了等等</w:t>
-      </w:r>
-    </w:p>
-    <w:p>
-      <w:r>
-        <w:t>操作提示：</w:t>
-      </w:r>
-    </w:p>
-    <w:p>
-      <w:r>
-        <w:t>主持人能量语言贯穿始终，随时随地注意点评所有参与者。</w:t>
-      </w:r>
-    </w:p>
-    <w:p>
-      <w:r>
-        <w:t>三、热场</w:t>
-      </w:r>
-    </w:p>
-    <w:p>
-      <w:r>
-        <w:t>大家好，我们家里的电器要打开开关才能使用，对吗？那我们的身体里的五脏六腑的工作模式也是有开关的，你们知道吗？为了我们越来越健康，现在打开我们的身体五脏六腑的开关，我们一起来完成开心八式，请大家起立。</w:t>
-      </w:r>
-    </w:p>
-    <w:p>
-      <w:r>
-        <w:t>要点：开心八式</w:t>
-      </w:r>
-    </w:p>
-    <w:p>
-      <w:r>
-        <w:t>眼睛微闭，用心的拍，开心的拍，越拍越痛，越痛越通，越通越轻松。</w:t>
-      </w:r>
-    </w:p>
-    <w:p>
-      <w:r>
-        <w:t>①腋窝--疏肝理气，我不生气；</w:t>
-      </w:r>
-    </w:p>
-    <w:p>
-      <w:r>
-        <w:t>②肘窝--心肺安宁，不悲不喜；</w:t>
-      </w:r>
-    </w:p>
-    <w:p>
-      <w:r>
-        <w:t>③股沟--脾胃健康，无忧无虑；</w:t>
-      </w:r>
-    </w:p>
-    <w:p>
-      <w:r>
-        <w:t>④膝窝--肾气充盈，不惊不惧。</w:t>
-      </w:r>
-    </w:p>
-    <w:p>
-      <w:r>
-        <w:t>四、提要求</w:t>
-      </w:r>
-    </w:p>
-    <w:p>
-      <w:r>
-        <w:t>大家想早一天解决问题，还是晚一天解决问题？</w:t>
-      </w:r>
-    </w:p>
-    <w:p>
-      <w:r>
-        <w:t>大家想早一天幸福，还是晚一天幸福？最好的办法就是一定要按照标准参与。</w:t>
-      </w:r>
-    </w:p>
-    <w:p>
-      <w:pPr>
-        <w:spacing w:after="60"/>
-      </w:pPr>
-      <w:r>
-        <w:t>1.学习中间不要走开，尽量全程参与。</w:t>
-      </w:r>
-    </w:p>
-    <w:p>
-      <w:pPr>
-        <w:spacing w:after="60"/>
-      </w:pPr>
-      <w:r>
-        <w:t>2.每个人都参与进来（看别人炒菜和自己动手炒菜，谁学会的更快）。</w:t>
-      </w:r>
-    </w:p>
-    <w:p>
-      <w:pPr>
-        <w:spacing w:after="60"/>
-      </w:pPr>
-      <w:r>
-        <w:t>3.学习过程中不要接打电话。以免耽误自己学习。</w:t>
-      </w:r>
-    </w:p>
-    <w:p>
-      <w:r>
-        <w:t>五、主题</w:t>
-      </w:r>
-    </w:p>
-    <w:p>
-      <w:pPr>
-        <w:spacing w:after="60"/>
-      </w:pPr>
-      <w:r>
-        <w:t>1.找优点对象：最好的朋友（发小，闺蜜，老同学等等）</w:t>
-      </w:r>
-    </w:p>
-    <w:p>
-      <w:pPr>
-        <w:spacing w:after="60"/>
-      </w:pPr>
-      <w:r>
-        <w:t>2.游戏规则：找到他（她）的1-2个优点写出来</w:t>
-      </w:r>
-    </w:p>
-    <w:p>
-      <w:pPr>
-        <w:spacing w:after="60"/>
-      </w:pPr>
-      <w:r>
-        <w:t>3.再用一个具体场景来描述呈现它的这个优点，简单写出来</w:t>
-      </w:r>
-    </w:p>
-    <w:p>
-      <w:pPr>
-        <w:spacing w:after="60"/>
-      </w:pPr>
-      <w:r>
-        <w:t>4.写完后，会议室结对子，两两互练，假设自己的要表达的那个人就在眼前，用第一人称现场模拟演示自己的优点加场景。</w:t>
-      </w:r>
-    </w:p>
-    <w:p>
-      <w:r>
-        <w:t>六、分享</w:t>
-      </w:r>
-    </w:p>
-    <w:p>
-      <w:r>
-        <w:t>每个人再简单分享一下今天的对练，有一种什么样的感受？为什么？</w:t>
-      </w:r>
-    </w:p>
-    <w:p>
-      <w:r>
-        <w:t>七、采访</w:t>
-      </w:r>
-    </w:p>
-    <w:p>
-      <w:r>
-        <w:t>①你以前跟你的发小闺蜜同学相处，有没有大声向他们表达过他们的优点,以及他们对你的帮助。</w:t>
-      </w:r>
-    </w:p>
-    <w:p>
-      <w:r>
-        <w:t>②通过今天的这种学习，你觉得有没有必要跟他真诚的表达一下他的优点或者曾经对你的帮助，或者曾经感动过你的那些场景，让你们之间的关系更加的亲密</w:t>
-      </w:r>
-    </w:p>
-    <w:p>
-      <w:r>
-        <w:t>③看到优点大声表达出来，让人跟人之间更有温度，咱们的生活是不是就会越来越美好？</w:t>
-      </w:r>
-    </w:p>
-    <w:p>
-      <w:r>
-        <w:t>④人的心不累了，身体是不是也不累了？无论做什么事，是不是都更有动力了？</w:t>
-      </w:r>
-    </w:p>
-    <w:p>
-      <w:r>
-        <w:t>⑤所以你愿意为了让自己的生活更美好而持续学习吗？</w:t>
-      </w:r>
-    </w:p>
-    <w:p>
-      <w:r>
-        <w:t>八、闭环</w:t>
-      </w:r>
-    </w:p>
-    <w:p>
-      <w:pPr>
-        <w:spacing w:after="60"/>
-      </w:pPr>
-      <w:r>
-        <w:t>1.闭环到正确的做法</w:t>
-      </w:r>
-    </w:p>
-    <w:p>
-      <w:r>
-        <w:t>①看正面放负面，多看优点并表达出来</w:t>
-      </w:r>
-    </w:p>
-    <w:p>
-      <w:r>
-        <w:t>②允许每个人有缺点存在，因为我们自己也有很多缺点。</w:t>
-      </w:r>
-    </w:p>
-    <w:p>
-      <w:pPr>
-        <w:spacing w:after="60"/>
-      </w:pPr>
-      <w:r>
-        <w:t>2.闭环到持续学习</w:t>
-      </w:r>
-    </w:p>
-    <w:p>
-      <w:r>
-        <w:t>幸福是一阵子的事儿，还是一辈子的事儿？所以坚持持续学习，有没有必要？</w:t>
-      </w:r>
-    </w:p>
-    <w:p>
-      <w:r>
-        <w:t>学习结束留作业用今天学到的方式至少给一到两个朋友进行实践点评，点评完及时在群里反馈结果，不限时长，不限字数多少，只要真诚点评就可以。如果效果不理想及时找到群主复盘找到原因并帮助解决</w:t>
-      </w:r>
-    </w:p>
-    <w:p>
-      <w:r>
-        <w:t>收作业</w:t>
-      </w:r>
-    </w:p>
-    <w:p>
-      <w:r>
-        <w:t>群主记得收作业，不按时完成作业，学习态度不端正的，默认不需要幸福，不重视家庭，对家庭不负责任，抱出群取消学习机会。</w:t>
-      </w:r>
-    </w:p>
-    <w:p>
-      <w:r>
-        <w:t>受益顾客交作业的标准：</w:t>
-      </w:r>
-    </w:p>
-    <w:p>
-      <w:r>
-        <w:t>今天你给哪一个家人表达了，在什么场景下用的？你当时说了一段什么样的话，你的家人给了你什么样的一个反应或者反馈？</w:t>
-      </w:r>
-    </w:p>
-    <w:p>
-      <w:r>
-        <w:t>正式训练第5天</w:t>
-      </w:r>
-    </w:p>
-    <w:p>
-      <w:r>
-        <w:t>共享陪听第三季智疗第41课《看不到别人的优点，你的人生就会黑暗》</w:t>
-      </w:r>
-    </w:p>
-    <w:p>
-      <w:r>
-        <w:t>一、破冰</w:t>
-      </w:r>
-    </w:p>
-    <w:p>
-      <w:r>
-        <w:t>一个是一个小伙儿，从小性格内向，不爱与人交流，自私自利，父母打电话来还不耐烦、嫌弃，遇事就会卷起身体，像刺猬一样用满身的刺来防御所有的人和事，内心像刀绞一样。</w:t>
-      </w:r>
-    </w:p>
-    <w:p>
-      <w:r>
-        <w:t>却因为走进幸福训练营，7天的时间，就打开了多年的心结，拔掉了身上一根根的刺，跟父母道歉，让爱苏醒。</w:t>
-      </w:r>
-    </w:p>
-    <w:p>
-      <w:r>
-        <w:t>到底他经历了什么，让他有如此巨大的转变？</w:t>
-      </w:r>
-    </w:p>
-    <w:p>
-      <w:r>
-        <w:t>想知道的家人，明天早上9点，腾讯会议，不见不散！</w:t>
-      </w:r>
-    </w:p>
-    <w:p>
-      <w:r>
-        <w:t>二、榜样采访</w:t>
-      </w:r>
-    </w:p>
-    <w:p>
-      <w:r>
-        <w:t>采访头一天的榜样，有突破的就让她来做两三分钟的分享（避免话停不下来的人，提前给她简单梳理一下，按照下面发问，三分钟左右精准分享）</w:t>
-      </w:r>
-    </w:p>
-    <w:p>
-      <w:pPr>
-        <w:spacing w:after="60"/>
-      </w:pPr>
-      <w:r>
-        <w:t>1.简单破冰引出榜样邀请这个人出来分享前，根据她的突破结果，简单精准一句话做个破冰，然后再邀请她出来分享。</w:t>
-      </w:r>
-    </w:p>
-    <w:p>
-      <w:pPr>
-        <w:spacing w:after="60"/>
-      </w:pPr>
-      <w:r>
-        <w:t>2.分享标准发问</w:t>
-      </w:r>
-    </w:p>
-    <w:p>
-      <w:r>
-        <w:t>①昨天学习后给家里哪个人表达了？当时是什么样的场景，家人给了一个什么样的反馈？自己有什么样的感触？</w:t>
-      </w:r>
-    </w:p>
-    <w:p>
-      <w:r>
-        <w:t>②遇见同样的问题，困扰多久了，以前是怎么解决的？得到了个什么结果？</w:t>
-      </w:r>
-    </w:p>
-    <w:p>
-      <w:r>
-        <w:t>③这样的学习效果，学习方式你是否满意？是否喜欢？</w:t>
-      </w:r>
-    </w:p>
-    <w:p>
-      <w:pPr>
-        <w:spacing w:after="60"/>
-      </w:pPr>
-      <w:r>
-        <w:t>3.分享完主持人简单总结两句，引出发心语言我们又帮到了一个家庭，又少了一个被家庭内耗伤害的人。感受到了开幸福训练营的意义，更有动力继续开下去</w:t>
-      </w:r>
-    </w:p>
-    <w:p>
-      <w:r>
-        <w:t>例：只是说对了一句话，家里的氛围却变了例：只是给老公说了一句话，成天冷冰冰的老公却笑了等等</w:t>
-      </w:r>
-    </w:p>
-    <w:p>
-      <w:r>
-        <w:t>操作提示：</w:t>
-      </w:r>
-    </w:p>
-    <w:p>
-      <w:r>
-        <w:t>主持人能量语言贯穿始终，随时随地注意点评所有参与者。</w:t>
-      </w:r>
-    </w:p>
-    <w:p>
-      <w:r>
-        <w:t>三、热场</w:t>
-      </w:r>
-    </w:p>
-    <w:p>
-      <w:r>
-        <w:t>大家好，我们家里的电器要打开开关才能使用，对吗？那我们的身体里的五脏六腑的工作模式也是有开关的，你们知道吗？为了我们越来越健康，现在打开我们的身体五脏六腑的开关，我们一起来完成开心八式，请大家起立。</w:t>
-      </w:r>
-    </w:p>
-    <w:p>
-      <w:r>
-        <w:t>要点：开心八式</w:t>
-      </w:r>
-    </w:p>
-    <w:p>
-      <w:r>
-        <w:t>眼睛微闭，用心的拍，开心的拍，越拍越痛，越痛越通，越通越轻松。</w:t>
-      </w:r>
-    </w:p>
-    <w:p>
-      <w:r>
-        <w:t>①腋窝--疏肝理气，我不生气；</w:t>
-      </w:r>
-    </w:p>
-    <w:p>
-      <w:r>
-        <w:t>②肘窝--心肺安宁，不悲不喜；</w:t>
-      </w:r>
-    </w:p>
-    <w:p>
-      <w:r>
-        <w:t>③股沟--脾胃健康，无忧无虑；</w:t>
-      </w:r>
-    </w:p>
-    <w:p>
-      <w:r>
-        <w:t>④膝窝--肾气充盈，不惊不惧。</w:t>
-      </w:r>
-    </w:p>
-    <w:p>
-      <w:r>
-        <w:t>四、提要求</w:t>
-      </w:r>
-    </w:p>
-    <w:p>
-      <w:r>
-        <w:t>大家想早一天解决问题，还是晚一天解决问题？大家想早一天幸福，还是晚一天幸福？最好的办法就是一定要按照标准参与。</w:t>
-      </w:r>
-    </w:p>
-    <w:p>
-      <w:pPr>
-        <w:spacing w:after="60"/>
-      </w:pPr>
-      <w:r>
-        <w:t>1.学习中间不要走开，尽量全程参与。</w:t>
-      </w:r>
-    </w:p>
-    <w:p>
-      <w:pPr>
-        <w:spacing w:after="60"/>
-      </w:pPr>
-      <w:r>
-        <w:t>2.每个人都参与进来（看别人炒菜和自己动手炒菜，谁学会的更快）。</w:t>
-      </w:r>
-    </w:p>
-    <w:p>
-      <w:pPr>
-        <w:spacing w:after="60"/>
-      </w:pPr>
-      <w:r>
-        <w:t>3.学习过程中不要接打电话。以免耽误自己学习。</w:t>
-      </w:r>
-    </w:p>
-    <w:p>
-      <w:r>
-        <w:t>五、主题</w:t>
-      </w:r>
-    </w:p>
-    <w:p>
-      <w:r>
-        <w:t>你长大了吗？什么叫长大？什么叫成熟？</w:t>
-      </w:r>
-    </w:p>
-    <w:p>
-      <w:r>
-        <w:t>共享陪听第三季智疗第41课《看不到别人的优点，你的人生就会黑暗》</w:t>
-      </w:r>
-    </w:p>
-    <w:p>
-      <w:r>
-        <w:t>六、分享听完这堂课，让你感触最深的是哪一句话或者是哪一个点？为什么？</w:t>
-      </w:r>
-    </w:p>
-    <w:p>
-      <w:r>
-        <w:t>七、采访1.我们大家有没有以前听到父母关心的叮嘱，也觉得烦，觉得唠叨，很不耐烦的时候，有没有甚至还没等他们的话说完，就把他们打断的时候？如果有，请你简单讲一个。</w:t>
-      </w:r>
-    </w:p>
-    <w:p>
-      <w:r>
-        <w:t>2.</w:t>
-      </w:r>
-    </w:p>
-    <w:p>
-      <w:pPr>
-        <w:spacing w:after="60"/>
-      </w:pPr>
-      <w:r>
-        <w:t>2.回想那些场景，此时此刻，你是一种什么样的心情？</w:t>
-      </w:r>
-    </w:p>
-    <w:p>
-      <w:r>
-        <w:t>3.</w:t>
-      </w:r>
-    </w:p>
-    <w:p>
-      <w:pPr>
-        <w:spacing w:after="60"/>
-      </w:pPr>
-      <w:r>
-        <w:t>3.这个世界上除了父母外，还有没有无条件不求回报，全身心爱我们的人？</w:t>
-      </w:r>
-    </w:p>
-    <w:p>
-      <w:r>
-        <w:t>4.</w:t>
-      </w:r>
-    </w:p>
-    <w:p>
-      <w:pPr>
-        <w:spacing w:after="60"/>
-      </w:pPr>
-      <w:r>
-        <w:t>4.如果没有学习今天这堂课，我们能意识到我们对父母的不耐烦，没耐心，其实也是对他们的伤害吗？</w:t>
-      </w:r>
-    </w:p>
-    <w:p>
-      <w:r>
-        <w:t>5.</w:t>
-      </w:r>
-    </w:p>
-    <w:p>
-      <w:pPr>
-        <w:spacing w:after="60"/>
-      </w:pPr>
-      <w:r>
-        <w:t>5.这个世界上除了父母的饭我们可以免费吃。剩下的每一口饭都需要自己去挣，大家认不认可？爱孩子是人的本能，但是孝敬父母才是真正的感恩。</w:t>
-      </w:r>
-    </w:p>
-    <w:p>
-      <w:r>
-        <w:t>6.</w:t>
-      </w:r>
-    </w:p>
-    <w:p>
-      <w:pPr>
-        <w:spacing w:after="60"/>
-      </w:pPr>
-      <w:r>
-        <w:t>6.那大家愿不愿意为我们曾经的任性不懂事给父母带来的伤害，去给自己的父母做一个道歉式的点评表白呢？</w:t>
-      </w:r>
-    </w:p>
-    <w:p>
-      <w:r>
-        <w:t>7.</w:t>
-      </w:r>
-    </w:p>
-    <w:p>
-      <w:pPr>
-        <w:spacing w:after="60"/>
-      </w:pPr>
-      <w:r>
-        <w:t>7.父母就是孩子们最好的榜样，我们用什么样的态度对待我们的父母，将来我们的孩子就会用什么样的态度来对待我们。</w:t>
-      </w:r>
-    </w:p>
-    <w:p>
-      <w:r>
-        <w:t>8.</w:t>
-      </w:r>
-    </w:p>
-    <w:p>
-      <w:pPr>
-        <w:spacing w:after="60"/>
-      </w:pPr>
-      <w:r>
-        <w:t>8.如果将来我们也想让我们的孩子对我们孝顺，懂事，细心体贴，我们要不要给他们做好榜样？</w:t>
-      </w:r>
-    </w:p>
-    <w:p>
-      <w:r>
-        <w:t>八、闭环1.你有多久没有给自己的父母好好说说话了？今天跟他好好的表达一下吧。</w:t>
-      </w:r>
-    </w:p>
-    <w:p>
-      <w:r>
-        <w:t>2.</w:t>
-      </w:r>
-    </w:p>
-    <w:p>
-      <w:pPr>
-        <w:spacing w:after="60"/>
-      </w:pPr>
-      <w:r>
-        <w:t>2.今天的学习内容好不好？像这样的学习内容，后面你还愿不愿意继续再学？</w:t>
-      </w:r>
-    </w:p>
-    <w:p>
-      <w:r>
-        <w:t>3.</w:t>
-      </w:r>
-    </w:p>
-    <w:p>
-      <w:pPr>
-        <w:spacing w:after="60"/>
-      </w:pPr>
-      <w:r>
-        <w:t>3.成就不是学历决定，而是由经历决定！</w:t>
-      </w:r>
-    </w:p>
-    <w:p>
-      <w:r>
-        <w:t>学习结束留作业每个人给自己的父母发一个点评问候信息或者打个点评问候电话，如果父母已经不在就给自己的亲人或其他家人说一段点评式的心里话，不限时长，不限字数多少，只要是真心点评的就可以，完成后及时在群里反馈结果，对方收到你的信息或者电话是一种什么样的反应？如果效果不理想及时找到群主复盘找到原因并帮助解决。</w:t>
-      </w:r>
-    </w:p>
-    <w:p>
-      <w:r>
-        <w:t>收作业群主记得收作业，不按时完成作业，学习态度不端正的，默认不需要幸福，不重视家庭，对家庭不负责任，抱出群取消学习机会。</w:t>
-      </w:r>
-    </w:p>
-    <w:p>
-      <w:r>
-        <w:t>受益顾客交作业的标准：今天你给哪一个家人表达了，在什么场景下用的？你当时说了一段什么样的话，你的家人给了你什么样的一个反应或者反馈？</w:t>
-      </w:r>
-    </w:p>
-    <w:p>
-      <w:r>
-        <w:t>正式训练第6天</w:t>
-      </w:r>
-    </w:p>
-    <w:p>
-      <w:r>
-        <w:t>共享《老男人超哥》视频</w:t>
-      </w:r>
-    </w:p>
-    <w:p>
-      <w:r>
-        <w:t>一、破冰现在很多人家庭不和睦，不是吵架就是冷战，一个月不说话，甚至更久，想要离婚的比比皆是。但有的家庭温馨和睦，笑声不断，事业也顺风顺水。这到底是哪里的问题呢？别着急，明天早上9点，腾讯会议为你揭秘！</w:t>
-      </w:r>
-    </w:p>
-    <w:p>
-      <w:r>
-        <w:t>二、榜样采访采访头一天的榜样，有突破的就让她来做两三分钟的分享（避免话停不下来的人，提前给她简单梳理一下，按照下面发问，三分钟左右精准分享）1.简单破冰引出榜样邀请这个人出来分享前，根据她的突破结果，简单精准一句话做个破冰，然后再邀请她出来分享2.分享标准发问①昨天学习后给家里哪个人表达了？当时是什么样的场景，家人给了一个什么样的反馈？自己有什么样的感触？②遇见同样的问题，困扰多久了，以前是怎么解决的？得到了个什么结果？③这样的学习效果，学习方式你是否满意？是否喜欢？ 3.分享完主持人简单总结两句，引出发心语言我们又帮到了一个家庭，又少了一个被家庭内耗伤害的人，感受到了开幸福训练营的意义，更有动力继续开下去例：只是说对了一句话，家里的氛围却变了例：只是给老公说了一句话，成天冷冰冰的老公却笑了等等</w:t>
-      </w:r>
-    </w:p>
-    <w:p>
-      <w:r>
-        <w:t>操作提示：主持人能量语言贯穿始终，随时随地注意点评所有参与者。</w:t>
-      </w:r>
-    </w:p>
-    <w:p>
-      <w:r>
-        <w:t>三、热场大家好，我们家里的电器要打开开关才能使用，对吗？那我们的身体里的五脏六腑的工作模式也是有开关的，你们知道吗？为了我们越来越健康，现在打开我们的身体五脏六腑的开关，我们一起来完成开心八式，请大家起立。要点：开心八式眼睛微闭，用心的拍，开心的拍，越拍越痛，越痛越通，越通越轻松。①腋窝--疏肝理气，我不生气；②肘窝--心肺安宁，不悲不喜；③股沟--脾胃健康，无忧无虑；④膝窝--肾气充盈，不惊不惧。</w:t>
-      </w:r>
-    </w:p>
-    <w:p>
-      <w:r>
-        <w:t>四、提要求大家想早一天解决问题，还是晚一天解决问题？大家想早一天幸福，还是晚一天幸福？最好的办法就是一定要按照标准参与。</w:t>
-      </w:r>
-    </w:p>
-    <w:p>
-      <w:r>
-        <w:t>1.</w:t>
-      </w:r>
-    </w:p>
-    <w:p>
-      <w:pPr>
-        <w:spacing w:after="60"/>
-      </w:pPr>
-      <w:r>
-        <w:t>1.学习中间不要走开，尽量全程参与。</w:t>
-      </w:r>
-    </w:p>
-    <w:p>
-      <w:r>
-        <w:t>2.</w:t>
-      </w:r>
-    </w:p>
-    <w:p>
-      <w:pPr>
-        <w:spacing w:after="60"/>
-      </w:pPr>
-      <w:r>
-        <w:t>2.每个人都参与进来（看别人炒菜和自己动手炒菜，谁学会的更快）。</w:t>
-      </w:r>
-    </w:p>
-    <w:p>
-      <w:r>
-        <w:t>3.</w:t>
-      </w:r>
-    </w:p>
-    <w:p>
-      <w:pPr>
-        <w:spacing w:after="60"/>
-      </w:pPr>
-      <w:r>
-        <w:t>3.学习过程中不要接打电话。以免耽误自己学习。</w:t>
-      </w:r>
-    </w:p>
-    <w:p>
-      <w:r>
-        <w:t>五、主题共享《老男人超哥》视频</w:t>
-      </w:r>
-    </w:p>
-    <w:p>
-      <w:r>
-        <w:t>六、分享看完这个视频，让你感受最深的是哪个点？每个人简单分享一下</w:t>
-      </w:r>
-    </w:p>
-    <w:p>
-      <w:r>
-        <w:t>七、采访1.选择题家庭幸福，事业成功，有很多朋友，有很多钱、车、房。如果只能选一样，你会选哪一个？说说你的选择理由。孩子，父母，爱人，兄弟姐妹，发小，朋友，同学。如果只选择一个，你会选哪一个？说说你的选择理由。</w:t>
-      </w:r>
-    </w:p>
-    <w:p>
-      <w:pPr>
-        <w:spacing w:after="60"/>
-      </w:pPr>
-      <w:r>
-        <w:t>2.视频里面的这对夫妻，看着是不是也是普通的家庭？但是他们的幸福感是不是非常的强烈？</w:t>
-      </w:r>
-    </w:p>
-    <w:p>
-      <w:pPr>
-        <w:spacing w:after="60"/>
-      </w:pPr>
-      <w:r>
-        <w:t>3.他们的幸福感是钱和容貌带给他们的，还是他们相互给到对方的满满的情绪价值给的？</w:t>
-      </w:r>
-    </w:p>
-    <w:p>
-      <w:pPr>
-        <w:spacing w:after="60"/>
-      </w:pPr>
-      <w:r>
-        <w:t>4.他们的嘴巴里说出来都是好帅，好看，好香，好吃，好棒</w:t>
-      </w:r>
-    </w:p>
-    <w:p>
-      <w:pPr>
-        <w:spacing w:after="60"/>
-      </w:pPr>
-      <w:r>
-        <w:t>5.如果是你们给家人做了一顿饭，听到的都是这样的，称赞的，肯定的词语，你是一种什么样的心情？是不是再累心里都开心，是不是下次还愿意继续做？</w:t>
-      </w:r>
-    </w:p>
-    <w:p>
-      <w:pPr>
-        <w:spacing w:after="60"/>
-      </w:pPr>
-      <w:r>
-        <w:t>6.其实大家愿不愿意承认，我们遇见的另一半，不管他是什么样的，他都是跟我们当下最匹配的，所以我们才会遇见。所以那些抱怨另一半的人都是傻子</w:t>
-      </w:r>
-    </w:p>
-    <w:p>
-      <w:pPr>
-        <w:spacing w:after="60"/>
-      </w:pPr>
-      <w:r>
-        <w:t>7.婚姻的本质是输赢还是幸福？</w:t>
-      </w:r>
-    </w:p>
-    <w:p>
-      <w:pPr>
-        <w:spacing w:after="60"/>
-      </w:pPr>
-      <w:r>
-        <w:t>8.好多人在日常生活当中出现一点小矛盾，就拼命的争吵，他们是不是都想赢？</w:t>
-      </w:r>
-    </w:p>
-    <w:p>
-      <w:pPr>
-        <w:spacing w:after="60"/>
-      </w:pPr>
-      <w:r>
-        <w:t>9.可是最后吵赢了的人，他赢了什么？表面看赢了一句话，却输掉了夫妻感情这到底是赢了还是输了？吵架吵赢了他得到了幸福感吗？</w:t>
-      </w:r>
-    </w:p>
-    <w:p>
-      <w:pPr>
-        <w:spacing w:after="60"/>
-      </w:pPr>
-      <w:r>
-        <w:t>10.没有学习过的家庭，随便一点点鸡毛蒜皮，是不是就容易争吵，抬杠？长期相互埋怨，家里每天都是鸡飞狗跳的，让自己也感觉身心疲惫</w:t>
-      </w:r>
-    </w:p>
-    <w:p>
-      <w:pPr>
-        <w:spacing w:after="60"/>
-      </w:pPr>
-      <w:r>
-        <w:t>11.长期争吵，抬杠，抱怨的家庭你认为会不会影响到孩子们的心情状态？</w:t>
-      </w:r>
-    </w:p>
-    <w:p>
-      <w:pPr>
-        <w:spacing w:after="60"/>
-      </w:pPr>
-      <w:r>
-        <w:t>12.时间久了，孩子们的学习是不是也会受影响？孩子们会不会变得自卑，木讷，性格受影响？父母经常爱抬杠，爱吵架的家庭，大家会发现孩子的性格都变得越来越暴躁，或者抑郁封闭自己，跟父母之间距离越来越远。 13.请问这样的结果是大家想要的吗？ 14.如果不想要正确的做法，我们应该怎么做呢？</w:t>
-      </w:r>
-    </w:p>
-    <w:p>
-      <w:r>
-        <w:t>八、闭环①多看对方的付出，并及时给予肯定，不吝啬赞美我们每个人都是普通人，都有很多缺点，所以不要用完美的要求去要求我们的另一半。②人生的在不同阶段会遇见不同的问题如果不学习，没有拥有解决问题的思维，是不是永远都是一地鸡毛？③所以我们要不要持续不断的学习？让我们成为一个解决问题的高手，从容面对生活当中的各种各样的现象，能力强了，问题也就少了。</w:t>
-      </w:r>
-    </w:p>
-    <w:p>
-      <w:r>
-        <w:t>学习结束留作业</w:t>
-      </w:r>
-    </w:p>
-    <w:p>
-      <w:r>
-        <w:t>继续给家人点评，哪怕是他说的一句话，或者他做的一顿饭，做的一件事。及时的给予肯定表达，点评完对方是什么样的反应，及时来群里分享反馈。让我们所有的人都来感受你们的幸福吧</w:t>
-      </w:r>
-    </w:p>
-    <w:p>
-      <w:r>
-        <w:t>收作业群主记得收作业，不按时完成作业，学习态度不端正的，默认不需要幸福，不重视家庭，对家庭不负责任，抱出群取消学习机会。</w:t>
-      </w:r>
-    </w:p>
-    <w:p>
-      <w:r>
-        <w:t>受益顾客交作业的标准：今天你给哪一个家人表达了，在什么场景下用的？你当时说了一段什么样的话，你的家人给了你什么样的一个反应或者反馈？  正式训练第7天</w:t>
-      </w:r>
-    </w:p>
-    <w:p>
-      <w:r>
-        <w:t>共享视频《你的烦恼或许正是你的幸福》</w:t>
-      </w:r>
-    </w:p>
-    <w:p>
-      <w:r>
-        <w:t>一、破冰你有没有经常为孩子写作业拖拉，沉迷游戏，动不动就责骂惩罚孩子叛逆说不了几句就抬杠，内心焦虑又无可奈何！别着急，一个视频就会让你摆脱这些烦恼，孩子主动减少玩游戏的时间，跟父母聊天，家里笑声不断。到底是什么视频这么神奇呢？想知道的家人，明天腾讯会议为你揭秘！</w:t>
-      </w:r>
-    </w:p>
-    <w:p>
-      <w:r>
-        <w:t>二、榜样采访采访头一天的榜样，有突破的就让她来做两三分钟的分享（避免话停不下来的人，提前给她简单梳理一下，按照下面发问，三分钟左右精准分享）</w:t>
-      </w:r>
-    </w:p>
-    <w:p>
-      <w:pPr>
-        <w:spacing w:after="60"/>
-      </w:pPr>
-      <w:r>
-        <w:t>1.简单破冰引出榜样邀请这个人出来分享前，根据她的突破结果，简单精准一句话做个破冰，然后再邀请她出来分享。</w:t>
-      </w:r>
-    </w:p>
-    <w:p>
-      <w:r>
-        <w:t>2.</w:t>
-      </w:r>
-    </w:p>
-    <w:p>
-      <w:pPr>
-        <w:spacing w:after="60"/>
-      </w:pPr>
-      <w:r>
-        <w:t>2.分享标准发问①昨天学习后给家里哪个人表达了？当时是什么样的场景，家人给了一个什么样的反馈？自己有什么样的感触？②遇见同样的问题，困扰多久了，以前是怎么解决的？得到了个什么结果？③这样的学习效果，学习方式你是否满意？是否喜欢？</w:t>
-      </w:r>
-    </w:p>
-    <w:p>
-      <w:r>
-        <w:t>3、</w:t>
-      </w:r>
-    </w:p>
-    <w:p>
-      <w:pPr>
-        <w:spacing w:after="60"/>
-      </w:pPr>
-      <w:r>
-        <w:t>3、分享完主持人简单总结两句，引出发心语言我们又帮到了一个家庭，又少了一个被家庭内耗伤害的人，感受到了开幸福训练营的意义，更有动力继续开下去例：只是说对了一句话，家里的氛围却变了例：只是给老公说了一句话，成天冷冰冰的老公却笑了等等</w:t>
-      </w:r>
-    </w:p>
-    <w:p>
-      <w:r>
-        <w:t>操作提示：主持人能量语言贯穿始终，随时随地注意点评所有参与者</w:t>
-      </w:r>
-    </w:p>
-    <w:p>
-      <w:r>
-        <w:t>三、热场大家好，我们家里的电器要打开开关才能使用，对吗？那我们的身体里的五脏六腑的工作模式也是有开关的，你们知道吗？为了我们越来越健康，现在打开我们的身体五脏六腑的开关，我们一起来完成开心八式，请大家起立。要点：开心八式眼睛微闭，用心的拍，开心的拍，越拍越痛，越痛越通，越通越轻松。①腋窝--疏肝理气，我不生气；②肘窝--心肺安宁，不悲不喜；③股沟--脾胃健康，无忧无虑；④膝窝--肾气充盈，不惊不惧。</w:t>
-      </w:r>
-    </w:p>
-    <w:p>
-      <w:r>
-        <w:t>四、提要求大家想早一天解决问题，还是晚一天解决问题？大家想早一天幸福，还是晚一天幸福？最好的办法就是一定要按照标准参与。</w:t>
-      </w:r>
-    </w:p>
-    <w:p>
-      <w:r>
-        <w:t>1.</w:t>
-      </w:r>
-    </w:p>
-    <w:p>
-      <w:pPr>
-        <w:spacing w:after="60"/>
-      </w:pPr>
-      <w:r>
-        <w:t>1.学习中间不要走开，尽量全程参与。</w:t>
-      </w:r>
-    </w:p>
-    <w:p>
-      <w:r>
-        <w:t>2.</w:t>
-      </w:r>
-    </w:p>
-    <w:p>
-      <w:pPr>
-        <w:spacing w:after="60"/>
-      </w:pPr>
-      <w:r>
-        <w:t>2.每个人都参与进来（看别人炒菜和自己动手炒菜，谁学会的更快）。</w:t>
-      </w:r>
-    </w:p>
-    <w:p>
-      <w:r>
-        <w:t>3.</w:t>
-      </w:r>
-    </w:p>
-    <w:p>
-      <w:pPr>
-        <w:spacing w:after="60"/>
-      </w:pPr>
-      <w:r>
-        <w:t>3.学习过程中不要接打电话。以免耽误自己学习。</w:t>
-      </w:r>
-    </w:p>
-    <w:p>
-      <w:r>
-        <w:t>五、主题共享视频《你的烦恼或许正是你的幸福》</w:t>
-      </w:r>
-    </w:p>
-    <w:p>
-      <w:r>
-        <w:t>六、分享看完视频，听着视频里这个爸爸的描述，里面让你触动最深的是哪一个点，这个点为什么触动了你？简单分享一下。</w:t>
-      </w:r>
-    </w:p>
-    <w:p>
-      <w:r>
-        <w:t>七、采访1.你平常有没有因为孩子写作业拖拉，上学磨蹭，辅导他写作业他总也不会，或者是因为老师的一个投诉电话打骂过孩子？</w:t>
-      </w:r>
-    </w:p>
-    <w:p>
-      <w:pPr>
-        <w:spacing w:after="60"/>
-      </w:pPr>
-      <w:r>
-        <w:t>2.有没有对孩子狠狠的说过你现在都觉得挺过分的话？</w:t>
-      </w:r>
-    </w:p>
-    <w:p>
-      <w:pPr>
-        <w:spacing w:after="60"/>
-      </w:pPr>
-      <w:r>
-        <w:t>3.有没有因为他考试的分少责骂他？</w:t>
-      </w:r>
-    </w:p>
-    <w:p>
-      <w:pPr>
-        <w:spacing w:after="60"/>
-      </w:pPr>
-      <w:r>
-        <w:t>4.有没有拿他跟别人家的孩子比？</w:t>
-      </w:r>
-    </w:p>
-    <w:p>
-      <w:pPr>
-        <w:spacing w:after="60"/>
-      </w:pPr>
-      <w:r>
-        <w:t>5.从小到大，因为他做了一件什么样的错事，被你狠狠的责骂或者惩罚？请你简单分享一个场景。</w:t>
-      </w:r>
-    </w:p>
-    <w:p>
-      <w:pPr>
-        <w:spacing w:after="60"/>
-      </w:pPr>
-      <w:r>
-        <w:t>6.当孩子们遇见各种各样问题的时候，你觉得他是故意把事情做坏的，还是他其实也很想做好，但是力不从心。</w:t>
-      </w:r>
-    </w:p>
-    <w:p>
-      <w:pPr>
-        <w:spacing w:after="60"/>
-      </w:pPr>
-      <w:r>
-        <w:t>7.如果我们把拖拉，磨蹭，考试等等这些问题当做是敌人，那么当敌人出现的时候，我们是应该跟孩子站在一起把敌人打败，还是应该跟敌人站在一起把孩子打败呢？</w:t>
-      </w:r>
-    </w:p>
-    <w:p>
-      <w:pPr>
-        <w:spacing w:after="60"/>
-      </w:pPr>
-      <w:r>
-        <w:t>8.那我们是怎么做的呢？做对了还是做错了？</w:t>
-      </w:r>
-    </w:p>
-    <w:p>
-      <w:pPr>
-        <w:spacing w:after="60"/>
-      </w:pPr>
-      <w:r>
-        <w:t>9.问题发生后，我们不断的指责，抱怨，甚至打骂孩子，对解决问题有没有任何的帮助？</w:t>
-      </w:r>
-    </w:p>
-    <w:p>
-      <w:pPr>
-        <w:spacing w:after="60"/>
-      </w:pPr>
-      <w:r>
-        <w:t>10.我们没有帮助孩子去打败问题，却跟问题站在一起指责抱怨孩子的时候，孩子心里会不会有压力，压抑，委屈，小的时候他不会反抗，你会发现他的胆子越来越小，受了委屈就爱哭，越来越不自信，越来越内向，有没有这种情况？</w:t>
-      </w:r>
-    </w:p>
-    <w:p>
-      <w:pPr>
-        <w:spacing w:after="60"/>
-      </w:pPr>
-      <w:r>
-        <w:t>11.随着时间的推移，孩子心里压的东西越来越多，孩子的性格会不会越来越急躁，暴躁，在你面前越来越没有耐心，动不动就跟你对抗，也就是所谓的叛逆期来了，所以叛逆是怎么来的大家明白了吗？</w:t>
-      </w:r>
-    </w:p>
-    <w:p>
-      <w:pPr>
-        <w:spacing w:after="60"/>
-      </w:pPr>
-      <w:r>
-        <w:t>12.有的孩子跟父母甚至一说话就吵，让父母也是焦虑万分却无可奈何，有没有这种情况发生？</w:t>
-      </w:r>
-    </w:p>
-    <w:p>
-      <w:pPr>
-        <w:spacing w:after="60"/>
-      </w:pPr>
-      <w:r>
-        <w:t>13.这些结果都是我们想要的吗？</w:t>
-      </w:r>
-    </w:p>
-    <w:p>
-      <w:pPr>
-        <w:spacing w:after="60"/>
-      </w:pPr>
-      <w:r>
-        <w:t>14.如果这些都不是我们想要的，那正确的做法我们应该怎么做呢？</w:t>
-      </w:r>
-    </w:p>
-    <w:p>
-      <w:pPr>
-        <w:spacing w:after="60"/>
-      </w:pPr>
-      <w:r>
-        <w:t>15.珍惜跟孩子们在一起的时光，孩子在身边，好好说话，有问题共同解决。</w:t>
-      </w:r>
-    </w:p>
-    <w:p>
-      <w:pPr>
-        <w:spacing w:after="60"/>
-      </w:pPr>
-      <w:r>
-        <w:t>16.多沟通多换位思考，不挑毛病指责，多相互体谅对方的不容易。（孩子们也有他们的不容易。）</w:t>
-      </w:r>
-    </w:p>
-    <w:p>
-      <w:r>
-        <w:t>八、闭环1.一天的学习能不能解决一辈子的问题？（肯定不能）那7天的学习能不能管一辈子？所以我们只有持续的学习，才不会让我们的生活过得一地鸡毛，对不对？</w:t>
-      </w:r>
-    </w:p>
-    <w:p>
-      <w:pPr>
-        <w:spacing w:after="60"/>
-      </w:pPr>
-      <w:r>
-        <w:t>2.类似这样的学习，后面我们还有很多，每一次学习都能解决我们生活当中的一个问题，当你持续不断的参加完我们的学习之后，你就会成为生活当中解决所有问题的高手，没有任何问题可以困住你。 所以下次如果还有类似的学习，你还愿不愿意再参加了？ 3.如果还要学习的话，提前报名，因为我们为了保证学习质量，每一次都有名额限制，提前告诉我这边给您备注，到时候开营学习的时候，我提前邀请您。如果要带朋友进群，也要提前报备，一个人只能带一个朋友，提前告诉我，我给您预留名额。</w:t>
-      </w:r>
-    </w:p>
-    <w:p>
-      <w:r>
-        <w:t>学习结束留作业</w:t>
-      </w:r>
-    </w:p>
-    <w:p>
-      <w:r>
-        <w:t>学习结束后，如果孩子在家的，抽空陪着孩子共同观看这个视频，并真诚的跟孩子聊，看完这个视频之后自己内心真实的感受，趁这个机会跟孩子说说很多的心里话。 如果孩子没有在身边，给孩子写个点评，说说你今天去孩子的房间了，看到空落落的房间，想到了孩子过往的某一个场景，某一件事。再来个表白吧。 点评完对方是什么样的反应，及时来群里分享反馈，让我们所有的人都来感受你们的幸福吧！</w:t>
-      </w:r>
-    </w:p>
-    <w:p>
-      <w:r>
-        <w:t>收作业群主记得收作业，不按时完成作业，学习态度不端正的，默认不需要幸福，不重视家庭，对家庭不负责任，抱出群取消学习机会。</w:t>
-      </w:r>
-    </w:p>
-    <w:p>
-      <w:r>
-        <w:t>受益顾客交作业的标准：今天你给哪一个家人表达了，在什么场景下用的？你当时说了一段什么样的话，你的家人给了你什么样的一个反应或者反馈？</w:t>
-      </w:r>
-    </w:p>
-    <w:p>
-      <w:r>
         <w:t>【先让每个人分享7天下来的收获和感受，5分钟/人】</w:t>
       </w:r>
     </w:p>
@@ -6861,7 +7167,57 @@
     </w:p>
     <w:p>
       <w:r>
-        <w:t>流程复制要求：✅百分百按照标准流程复制，不用自己的老思维随意增减内容✅没有参加沙龙，没有筛选的顾客，不能升级参加7天幸福训练营✅ 严格按照要求筛选，不做筛选，效果就会打脸✅第1期跟不上，给一次机会，第2期不配合，永远失去机会✅ 总教练给教练通关，教练给组长通关，组长给组员通关✅一天通一节课，通一节实战一节✅所有参与复制的老师，每天必须群里汇报。要两个反馈，不是光要顾客的反馈，我们还要咱们群主的反馈，也就是咱们开沙龙伙伴的使用反馈，叫落地反馈，顾客的反馈，叫服务反馈。顾客的反馈叫做服务反馈，也就是案例。伙伴的反馈，也就是所有群主的反馈，叫做落地反馈，测咱的内容落不落地。我今天进行到第几课了？然后群里的那些人学的状态怎么样，顾客的反馈是什么样的，喜不喜欢这样的内容✅每个人必须要有自己的发心故事，请提前写好自己的发心故事✅所有参与的每一位伙伴，每一天发截屏和朋友圈实战反馈，做效果展示，为自己营造人设，发朋友圈，视频号，社群（描述就今天做了什么，想了什么给AI，让AI写出温暖的话，用来发朋友圈和视频）✅对于拿到幸福的榜样案例，给予深度点评和梳理，点评他的成长，点评他行为背后的意义，点评他的学习改变对家庭，社会的意义，起到拔高、激活使命的作用</w:t>
+        <w:t>流程复制要求：</w:t>
+      </w:r>
+    </w:p>
+    <w:p>
+      <w:r>
+        <w:t>✅百分百按照标准流程复制，不用自己的老思维随意增减内容</w:t>
+      </w:r>
+    </w:p>
+    <w:p>
+      <w:r>
+        <w:t>✅没有参加沙龙，没有筛选的顾客，不能升级参加7天幸福训练营</w:t>
+      </w:r>
+    </w:p>
+    <w:p>
+      <w:r>
+        <w:t>✅ 严格按照要求筛选，不做筛选，效果就会打脸</w:t>
+      </w:r>
+    </w:p>
+    <w:p>
+      <w:r>
+        <w:t>✅第1期跟不上，给一次机会，第2期不配合，永远失去机会</w:t>
+      </w:r>
+    </w:p>
+    <w:p>
+      <w:r>
+        <w:t>✅ 总教练给教练通关，教练给组长通关，组长给组员通关</w:t>
+      </w:r>
+    </w:p>
+    <w:p>
+      <w:r>
+        <w:t>✅一天通一节课，通一节实战一节</w:t>
+      </w:r>
+    </w:p>
+    <w:p>
+      <w:r>
+        <w:t>✅所有参与复制的老师，每天必须群里汇报。要两个反馈，不是光要顾客的反馈，我们还要咱们群主的反馈，也就是咱们开沙龙伙伴的使用反馈，叫落地反馈，顾客的反馈，叫服务反馈。顾客的反馈叫做服务反馈，也就是案例。伙伴的反馈，也就是所有群主的反馈，叫做落地反馈，测咱的内容落不落地。我今天进行到第几课了？然后群里的那些人学的状态怎么样，顾客的反馈是什么样的，喜不喜欢这样的内容</w:t>
+      </w:r>
+    </w:p>
+    <w:p>
+      <w:r>
+        <w:t>✅每个人必须要有自己的发心故事，请提前写好自己的发心故事</w:t>
+      </w:r>
+    </w:p>
+    <w:p>
+      <w:r>
+        <w:t>✅所有参与的每一位伙伴，每一天发截屏和朋友圈实战反馈，做效果展示，为自己营造人设，发朋友圈，视频号，社群（描述就今天做了什么，想了什么给AI，让AI写出温暖的话，用来发朋友圈和视频）</w:t>
+      </w:r>
+    </w:p>
+    <w:p>
+      <w:r>
+        <w:t>✅对于拿到幸福的榜样案例，给予深度点评和梳理，点评他的成长，点评他行为背后的意义，点评他的学习改变对家庭，社会的意义，起到拔高、激活使命的作用</w:t>
       </w:r>
     </w:p>
     <w:p>

</xml_diff>